<commit_message>
Anomaly Detection + report
</commit_message>
<xml_diff>
--- a/anomaly_detection/docs/UR10e_Anomali_Tespiti_Teknik_Rapor.docx
+++ b/anomaly_detection/docs/UR10e_Anomali_Tespiti_Teknik_Rapor.docx
@@ -10324,6 +10324,506 @@
       </w:r>
     </w:p>
     <w:p>
+      <w:pPr>
+        <w:spacing w:before="120" w:after="40"/>
+        <w:jc w:val="center"/>
+      </w:pPr>
+      <w:r>
+        <w:drawing>
+          <wp:inline xmlns:a="http://schemas.openxmlformats.org/drawingml/2006/main" xmlns:pic="http://schemas.openxmlformats.org/drawingml/2006/picture">
+            <wp:extent cx="5760000" cy="3010435"/>
+            <wp:docPr id="1" name="Picture 1"/>
+            <wp:cNvGraphicFramePr>
+              <a:graphicFrameLocks noChangeAspect="1"/>
+            </wp:cNvGraphicFramePr>
+            <a:graphic>
+              <a:graphicData uri="http://schemas.openxmlformats.org/drawingml/2006/picture">
+                <pic:pic>
+                  <pic:nvPicPr>
+                    <pic:cNvPr id="0" name="sekil_pr_roc.png"/>
+                    <pic:cNvPicPr/>
+                  </pic:nvPicPr>
+                  <pic:blipFill>
+                    <a:blip r:embed="rId9"/>
+                    <a:stretch>
+                      <a:fillRect/>
+                    </a:stretch>
+                  </pic:blipFill>
+                  <pic:spPr>
+                    <a:xfrm>
+                      <a:off x="0" y="0"/>
+                      <a:ext cx="5760000" cy="3010435"/>
+                    </a:xfrm>
+                    <a:prstGeom prst="rect"/>
+                  </pic:spPr>
+                </pic:pic>
+              </a:graphicData>
+            </a:graphic>
+          </wp:inline>
+        </w:drawing>
+      </w:r>
+    </w:p>
+    <w:p>
+      <w:pPr>
+        <w:spacing w:after="240"/>
+        <w:jc w:val="center"/>
+      </w:pPr>
+      <w:r>
+        <w:rPr>
+          <w:i/>
+          <w:color w:val="555F6B"/>
+          <w:sz w:val="18"/>
+        </w:rPr>
+        <w:t>Şekil 6.1. Düzeltilmiş hattın kesinlik–duyarlılık ve ROC eğrileri (41.688 test penceresi, %8,7 arızalı). Birleşim her iki eğride de iki tekil modelin üstünde kalmaktadır; PR panelinde fark daha belirgindir, çünkü ROC sınıf dengesizliğinde iyimser davranmaktadır. Kesikli çizgi rastgele sınıflandırıcının kesinlik tabanıdır (0,087).</w:t>
+      </w:r>
+    </w:p>
+    <w:p>
+      <w:r>
+        <w:t>Bildirinin çalışma noktası (θ = 0,6436) doğrudan sayılabilir hâle getirildiğinde karar dağılımı Şekil 6.2'deki gibidir.</w:t>
+      </w:r>
+    </w:p>
+    <w:p>
+      <w:pPr>
+        <w:spacing w:before="120" w:after="40"/>
+        <w:jc w:val="center"/>
+      </w:pPr>
+      <w:r>
+        <w:drawing>
+          <wp:inline xmlns:a="http://schemas.openxmlformats.org/drawingml/2006/main" xmlns:pic="http://schemas.openxmlformats.org/drawingml/2006/picture">
+            <wp:extent cx="5760000" cy="2662786"/>
+            <wp:docPr id="2" name="Picture 2"/>
+            <wp:cNvGraphicFramePr>
+              <a:graphicFrameLocks noChangeAspect="1"/>
+            </wp:cNvGraphicFramePr>
+            <a:graphic>
+              <a:graphicData uri="http://schemas.openxmlformats.org/drawingml/2006/picture">
+                <pic:pic>
+                  <pic:nvPicPr>
+                    <pic:cNvPr id="0" name="sekil_karisiklik.png"/>
+                    <pic:cNvPicPr/>
+                  </pic:nvPicPr>
+                  <pic:blipFill>
+                    <a:blip r:embed="rId10"/>
+                    <a:stretch>
+                      <a:fillRect/>
+                    </a:stretch>
+                  </pic:blipFill>
+                  <pic:spPr>
+                    <a:xfrm>
+                      <a:off x="0" y="0"/>
+                      <a:ext cx="5760000" cy="2662786"/>
+                    </a:xfrm>
+                    <a:prstGeom prst="rect"/>
+                  </pic:spPr>
+                </pic:pic>
+              </a:graphicData>
+            </a:graphic>
+          </wp:inline>
+        </w:drawing>
+      </w:r>
+    </w:p>
+    <w:p>
+      <w:pPr>
+        <w:spacing w:after="240"/>
+        <w:jc w:val="center"/>
+      </w:pPr>
+      <w:r>
+        <w:rPr>
+          <w:i/>
+          <w:color w:val="555F6B"/>
+          <w:sz w:val="18"/>
+        </w:rPr>
+        <w:t>Şekil 6.2. FMU doğrulama setinden gelen çalışma noktasındaki karışıklık matrisi (satır normalleştirmeli) ve türetilmiş ölçütler. Hücre değerleri Tablo 6.2'de sayıyla verilmiştir.</w:t>
+      </w:r>
+    </w:p>
+    <w:tbl>
+      <w:tblPr>
+        <w:tblStyle w:val="TableGrid"/>
+        <w:tblW w:type="auto" w:w="0"/>
+        <w:jc w:val="center"/>
+        <w:tblLook w:firstColumn="1" w:firstRow="1" w:lastColumn="0" w:lastRow="0" w:noHBand="0" w:noVBand="1" w:val="04A0"/>
+      </w:tblPr>
+      <w:tblGrid>
+        <w:gridCol w:w="2379"/>
+        <w:gridCol w:w="2379"/>
+        <w:gridCol w:w="2379"/>
+        <w:gridCol w:w="2379"/>
+      </w:tblGrid>
+      <w:tr>
+        <w:tc>
+          <w:tcPr>
+            <w:tcW w:type="dxa" w:w="2381"/>
+            <w:shd w:val="clear" w:fill="E7EBEF"/>
+          </w:tcPr>
+          <w:p>
+            <w:pPr>
+              <w:spacing w:after="0"/>
+              <w:jc w:val="left"/>
+            </w:pPr>
+            <w:r/>
+            <w:r>
+              <w:rPr>
+                <w:b/>
+                <w:sz w:val="18"/>
+              </w:rPr>
+            </w:r>
+          </w:p>
+        </w:tc>
+        <w:tc>
+          <w:tcPr>
+            <w:tcW w:type="dxa" w:w="2268"/>
+            <w:shd w:val="clear" w:fill="E7EBEF"/>
+          </w:tcPr>
+          <w:p>
+            <w:pPr>
+              <w:spacing w:after="0"/>
+              <w:jc w:val="right"/>
+            </w:pPr>
+            <w:r/>
+            <w:r>
+              <w:rPr>
+                <w:b/>
+                <w:sz w:val="18"/>
+              </w:rPr>
+              <w:t>Tahmin: normal</w:t>
+            </w:r>
+          </w:p>
+        </w:tc>
+        <w:tc>
+          <w:tcPr>
+            <w:tcW w:type="dxa" w:w="2268"/>
+            <w:shd w:val="clear" w:fill="E7EBEF"/>
+          </w:tcPr>
+          <w:p>
+            <w:pPr>
+              <w:spacing w:after="0"/>
+              <w:jc w:val="right"/>
+            </w:pPr>
+            <w:r/>
+            <w:r>
+              <w:rPr>
+                <w:b/>
+                <w:sz w:val="18"/>
+              </w:rPr>
+              <w:t>Tahmin: anomali</w:t>
+            </w:r>
+          </w:p>
+        </w:tc>
+        <w:tc>
+          <w:tcPr>
+            <w:tcW w:type="dxa" w:w="1474"/>
+            <w:shd w:val="clear" w:fill="E7EBEF"/>
+          </w:tcPr>
+          <w:p>
+            <w:pPr>
+              <w:spacing w:after="0"/>
+              <w:jc w:val="right"/>
+            </w:pPr>
+            <w:r/>
+            <w:r>
+              <w:rPr>
+                <w:b/>
+                <w:sz w:val="18"/>
+              </w:rPr>
+              <w:t>Toplam</w:t>
+            </w:r>
+          </w:p>
+        </w:tc>
+      </w:tr>
+      <w:tr>
+        <w:tc>
+          <w:tcPr>
+            <w:tcW w:type="dxa" w:w="2381"/>
+          </w:tcPr>
+          <w:p>
+            <w:pPr>
+              <w:spacing w:after="0"/>
+              <w:jc w:val="left"/>
+            </w:pPr>
+            <w:r/>
+            <w:r>
+              <w:rPr>
+                <w:sz w:val="18"/>
+              </w:rPr>
+              <w:t>Gerçek: normal</w:t>
+            </w:r>
+          </w:p>
+        </w:tc>
+        <w:tc>
+          <w:tcPr>
+            <w:tcW w:type="dxa" w:w="2268"/>
+          </w:tcPr>
+          <w:p>
+            <w:pPr>
+              <w:spacing w:after="0"/>
+              <w:jc w:val="right"/>
+            </w:pPr>
+            <w:r/>
+            <w:r>
+              <w:rPr>
+                <w:sz w:val="18"/>
+              </w:rPr>
+              <w:t>37.519  (DN)</w:t>
+            </w:r>
+          </w:p>
+        </w:tc>
+        <w:tc>
+          <w:tcPr>
+            <w:tcW w:type="dxa" w:w="2268"/>
+          </w:tcPr>
+          <w:p>
+            <w:pPr>
+              <w:spacing w:after="0"/>
+              <w:jc w:val="right"/>
+            </w:pPr>
+            <w:r/>
+            <w:r>
+              <w:rPr>
+                <w:sz w:val="18"/>
+              </w:rPr>
+              <w:t>546  (YP)</w:t>
+            </w:r>
+          </w:p>
+        </w:tc>
+        <w:tc>
+          <w:tcPr>
+            <w:tcW w:type="dxa" w:w="1474"/>
+          </w:tcPr>
+          <w:p>
+            <w:pPr>
+              <w:spacing w:after="0"/>
+              <w:jc w:val="right"/>
+            </w:pPr>
+            <w:r/>
+            <w:r>
+              <w:rPr>
+                <w:sz w:val="18"/>
+              </w:rPr>
+              <w:t>38.065</w:t>
+            </w:r>
+          </w:p>
+        </w:tc>
+      </w:tr>
+      <w:tr>
+        <w:tc>
+          <w:tcPr>
+            <w:tcW w:type="dxa" w:w="2381"/>
+            <w:shd w:val="clear" w:fill="E3F0F1"/>
+          </w:tcPr>
+          <w:p>
+            <w:pPr>
+              <w:spacing w:after="0"/>
+              <w:jc w:val="left"/>
+            </w:pPr>
+            <w:r>
+              <w:rPr>
+                <w:b/>
+              </w:rPr>
+            </w:r>
+            <w:r>
+              <w:rPr>
+                <w:b/>
+                <w:sz w:val="18"/>
+              </w:rPr>
+              <w:t>Gerçek: anomali</w:t>
+            </w:r>
+          </w:p>
+        </w:tc>
+        <w:tc>
+          <w:tcPr>
+            <w:tcW w:type="dxa" w:w="2268"/>
+            <w:shd w:val="clear" w:fill="E3F0F1"/>
+          </w:tcPr>
+          <w:p>
+            <w:pPr>
+              <w:spacing w:after="0"/>
+              <w:jc w:val="right"/>
+            </w:pPr>
+            <w:r>
+              <w:rPr>
+                <w:b/>
+              </w:rPr>
+            </w:r>
+            <w:r>
+              <w:rPr>
+                <w:b/>
+                <w:sz w:val="18"/>
+              </w:rPr>
+              <w:t>892  (YN)</w:t>
+            </w:r>
+          </w:p>
+        </w:tc>
+        <w:tc>
+          <w:tcPr>
+            <w:tcW w:type="dxa" w:w="2268"/>
+            <w:shd w:val="clear" w:fill="E3F0F1"/>
+          </w:tcPr>
+          <w:p>
+            <w:pPr>
+              <w:spacing w:after="0"/>
+              <w:jc w:val="right"/>
+            </w:pPr>
+            <w:r>
+              <w:rPr>
+                <w:b/>
+              </w:rPr>
+            </w:r>
+            <w:r>
+              <w:rPr>
+                <w:b/>
+                <w:sz w:val="18"/>
+              </w:rPr>
+              <w:t>2.731  (DP)</w:t>
+            </w:r>
+          </w:p>
+        </w:tc>
+        <w:tc>
+          <w:tcPr>
+            <w:tcW w:type="dxa" w:w="1474"/>
+            <w:shd w:val="clear" w:fill="E3F0F1"/>
+          </w:tcPr>
+          <w:p>
+            <w:pPr>
+              <w:spacing w:after="0"/>
+              <w:jc w:val="right"/>
+            </w:pPr>
+            <w:r>
+              <w:rPr>
+                <w:b/>
+              </w:rPr>
+            </w:r>
+            <w:r>
+              <w:rPr>
+                <w:b/>
+                <w:sz w:val="18"/>
+              </w:rPr>
+              <w:t>3.623</w:t>
+            </w:r>
+          </w:p>
+        </w:tc>
+      </w:tr>
+      <w:tr>
+        <w:tc>
+          <w:tcPr>
+            <w:tcW w:type="dxa" w:w="2381"/>
+          </w:tcPr>
+          <w:p>
+            <w:pPr>
+              <w:spacing w:after="0"/>
+              <w:jc w:val="left"/>
+            </w:pPr>
+            <w:r/>
+            <w:r>
+              <w:rPr>
+                <w:sz w:val="18"/>
+              </w:rPr>
+              <w:t>Toplam</w:t>
+            </w:r>
+          </w:p>
+        </w:tc>
+        <w:tc>
+          <w:tcPr>
+            <w:tcW w:type="dxa" w:w="2268"/>
+          </w:tcPr>
+          <w:p>
+            <w:pPr>
+              <w:spacing w:after="0"/>
+              <w:jc w:val="right"/>
+            </w:pPr>
+            <w:r/>
+            <w:r>
+              <w:rPr>
+                <w:sz w:val="18"/>
+              </w:rPr>
+              <w:t>38.411</w:t>
+            </w:r>
+          </w:p>
+        </w:tc>
+        <w:tc>
+          <w:tcPr>
+            <w:tcW w:type="dxa" w:w="2268"/>
+          </w:tcPr>
+          <w:p>
+            <w:pPr>
+              <w:spacing w:after="0"/>
+              <w:jc w:val="right"/>
+            </w:pPr>
+            <w:r/>
+            <w:r>
+              <w:rPr>
+                <w:sz w:val="18"/>
+              </w:rPr>
+              <w:t>3.277</w:t>
+            </w:r>
+          </w:p>
+        </w:tc>
+        <w:tc>
+          <w:tcPr>
+            <w:tcW w:type="dxa" w:w="1474"/>
+          </w:tcPr>
+          <w:p>
+            <w:pPr>
+              <w:spacing w:after="0"/>
+              <w:jc w:val="right"/>
+            </w:pPr>
+            <w:r/>
+            <w:r>
+              <w:rPr>
+                <w:sz w:val="18"/>
+              </w:rPr>
+              <w:t>41.688</w:t>
+            </w:r>
+          </w:p>
+        </w:tc>
+      </w:tr>
+    </w:tbl>
+    <w:p>
+      <w:pPr>
+        <w:spacing w:before="60" w:after="240"/>
+        <w:jc w:val="left"/>
+      </w:pPr>
+      <w:r>
+        <w:rPr>
+          <w:i/>
+          <w:color w:val="555F6B"/>
+          <w:sz w:val="18"/>
+        </w:rPr>
+        <w:t xml:space="preserve">Tablo 6.2. θ = 0,6436 çalışma noktasında karışıklık matrisi. Buradan kesinlik 0,833, duyarlılık 0,754, F1 0,792 ve özgüllük 0,986 çıkmaktadır; bu değerler </w:t>
+      </w:r>
+      <w:r>
+        <w:rPr>
+          <w:rFonts w:ascii="Consolas" w:hAnsi="Consolas"/>
+          <w:color w:val="555F6B"/>
+          <w:sz w:val="17"/>
+        </w:rPr>
+        <w:t>fusion_config.json</w:t>
+      </w:r>
+      <w:r>
+        <w:rPr>
+          <w:i/>
+          <w:color w:val="555F6B"/>
+          <w:sz w:val="18"/>
+        </w:rPr>
+        <w:t xml:space="preserve"> içindeki </w:t>
+      </w:r>
+      <w:r>
+        <w:rPr>
+          <w:rFonts w:ascii="Consolas" w:hAnsi="Consolas"/>
+          <w:color w:val="555F6B"/>
+          <w:sz w:val="17"/>
+        </w:rPr>
+        <w:t>expected</w:t>
+      </w:r>
+      <w:r>
+        <w:rPr>
+          <w:i/>
+          <w:color w:val="555F6B"/>
+          <w:sz w:val="18"/>
+        </w:rPr>
+        <w:t xml:space="preserve"> alanıyla birebir aynıdır. Temiz doğrulama kümesindeki yanlış alarm oranı %3,0'tür.</w:t>
+      </w:r>
+    </w:p>
+    <w:p>
       <w:r>
         <w:t xml:space="preserve">Mutlak değerlerin düşmesi beklenen ve açıklanabilir bir sonuçtur. Düzeltilmiş hatta arıza genlikleri gerçek Nm ölçeğinde uygulanmakta, yani problem </w:t>
       </w:r>
@@ -10850,7 +11350,7 @@
           <w:color w:val="555F6B"/>
           <w:sz w:val="18"/>
         </w:rPr>
-        <w:t>Tablo 6.2. Arıza tipine göre AUC. Gizyazar (kalıntı 0,988 ↔ ham 0,491) ve sensör gürültüsü (kalıntı 0,296 ↔ ham 1,000) satırları bildirinin asimetrisini neredeyse birebir yeniden üretmektedir.</w:t>
+        <w:t>Tablo 6.3. Arıza tipine göre AUC. Gizyazar (kalıntı 0,988 ↔ ham 0,491) ve sensör gürültüsü (kalıntı 0,296 ↔ ham 1,000) satırları bildirinin asimetrisini neredeyse birebir yeniden üretmektedir.</w:t>
       </w:r>
     </w:p>
     <w:p>
@@ -10865,6 +11365,60 @@
       </w:r>
       <w:r>
         <w:t xml:space="preserve"> — birleşimin varlık sebebi tam olarak budur.</w:t>
+      </w:r>
+    </w:p>
+    <w:p>
+      <w:pPr>
+        <w:spacing w:before="120" w:after="40"/>
+        <w:jc w:val="center"/>
+      </w:pPr>
+      <w:r>
+        <w:drawing>
+          <wp:inline xmlns:a="http://schemas.openxmlformats.org/drawingml/2006/main" xmlns:pic="http://schemas.openxmlformats.org/drawingml/2006/picture">
+            <wp:extent cx="5760000" cy="2628029"/>
+            <wp:docPr id="3" name="Picture 3"/>
+            <wp:cNvGraphicFramePr>
+              <a:graphicFrameLocks noChangeAspect="1"/>
+            </wp:cNvGraphicFramePr>
+            <a:graphic>
+              <a:graphicData uri="http://schemas.openxmlformats.org/drawingml/2006/picture">
+                <pic:pic>
+                  <pic:nvPicPr>
+                    <pic:cNvPr id="0" name="sekil_ariza_tipi.png"/>
+                    <pic:cNvPicPr/>
+                  </pic:nvPicPr>
+                  <pic:blipFill>
+                    <a:blip r:embed="rId11"/>
+                    <a:stretch>
+                      <a:fillRect/>
+                    </a:stretch>
+                  </pic:blipFill>
+                  <pic:spPr>
+                    <a:xfrm>
+                      <a:off x="0" y="0"/>
+                      <a:ext cx="5760000" cy="2628029"/>
+                    </a:xfrm>
+                    <a:prstGeom prst="rect"/>
+                  </pic:spPr>
+                </pic:pic>
+              </a:graphicData>
+            </a:graphic>
+          </wp:inline>
+        </w:drawing>
+      </w:r>
+    </w:p>
+    <w:p>
+      <w:pPr>
+        <w:spacing w:after="240"/>
+        <w:jc w:val="center"/>
+      </w:pPr>
+      <w:r>
+        <w:rPr>
+          <w:i/>
+          <w:color w:val="555F6B"/>
+          <w:sz w:val="18"/>
+        </w:rPr>
+        <w:t>Şekil 6.3. Arıza tipine göre tespit oranı. Tamamlayıcılık grafikte doğrudan görülmektedir: gizyazar hatasında kalıntı modeli 0,99, ham model 0,49; sensör gürültüsünde tam tersi (0,30'a karşı 1,00). Birleşim her iki sütunda da yüksek olanı takip etmektedir. Motor kayması ise her iki model için de zor kalmaktadır (Bölüm 11.1).</w:t>
       </w:r>
     </w:p>
     <w:p>
@@ -11353,7 +11907,7 @@
           <w:color w:val="555F6B"/>
           <w:sz w:val="18"/>
         </w:rPr>
-        <w:t>Tablo 6.3. Pencere düzeyinde tamamlayıcılık, her model kendi P97 eşiğiyle. Yalnızca-kalıntı oranı bildiriyle 0,2 puan farkla örtüşmektedir.</w:t>
+        <w:t>Tablo 6.4. Pencere düzeyinde tamamlayıcılık, her model kendi P97 eşiğiyle. Yalnızca-kalıntı oranı bildiriyle 0,2 puan farkla örtüşmektedir.</w:t>
       </w:r>
     </w:p>
     <w:p>
@@ -12180,7 +12734,7 @@
           <w:color w:val="555F6B"/>
           <w:sz w:val="18"/>
         </w:rPr>
-        <w:t>Tablo 6.4. Ağırlık taraması (</w:t>
+        <w:t>Tablo 6.5. Ağırlık taraması (</w:t>
       </w:r>
       <w:r>
         <w:rPr>
@@ -12211,6 +12765,65 @@
       </w:r>
       <w:r>
         <w:t>'dir (0,792'ye karşılık 0,613). Bildirinin raporladığı kazanç +0,161'dir; iki hat farklı mutlak seviyelerde çalışmasına rağmen birleşimin sağladığı marj korunmuştur.</w:t>
+      </w:r>
+    </w:p>
+    <w:p>
+      <w:pPr>
+        <w:spacing w:before="120" w:after="40"/>
+        <w:jc w:val="center"/>
+      </w:pPr>
+      <w:r>
+        <w:drawing>
+          <wp:inline xmlns:a="http://schemas.openxmlformats.org/drawingml/2006/main" xmlns:pic="http://schemas.openxmlformats.org/drawingml/2006/picture">
+            <wp:extent cx="5760000" cy="2631172"/>
+            <wp:docPr id="4" name="Picture 4"/>
+            <wp:cNvGraphicFramePr>
+              <a:graphicFrameLocks noChangeAspect="1"/>
+            </wp:cNvGraphicFramePr>
+            <a:graphic>
+              <a:graphicData uri="http://schemas.openxmlformats.org/drawingml/2006/picture">
+                <pic:pic>
+                  <pic:nvPicPr>
+                    <pic:cNvPr id="0" name="sekil_agirlik.png"/>
+                    <pic:cNvPicPr/>
+                  </pic:nvPicPr>
+                  <pic:blipFill>
+                    <a:blip r:embed="rId12"/>
+                    <a:stretch>
+                      <a:fillRect/>
+                    </a:stretch>
+                  </pic:blipFill>
+                  <pic:spPr>
+                    <a:xfrm>
+                      <a:off x="0" y="0"/>
+                      <a:ext cx="5760000" cy="2631172"/>
+                    </a:xfrm>
+                    <a:prstGeom prst="rect"/>
+                  </pic:spPr>
+                </pic:pic>
+              </a:graphicData>
+            </a:graphic>
+          </wp:inline>
+        </w:drawing>
+      </w:r>
+    </w:p>
+    <w:p>
+      <w:pPr>
+        <w:spacing w:after="240"/>
+        <w:jc w:val="center"/>
+      </w:pPr>
+      <w:r>
+        <w:rPr>
+          <w:i/>
+          <w:color w:val="555F6B"/>
+          <w:sz w:val="18"/>
+        </w:rPr>
+        <w:t>Şekil 6.4. w_kal süpürmesi. Eğri 0,3–0,95 arasında geniş bir plato çizmektedir, yani bildirinin 0,95 değeri hassas bir ayar noktası değildir. Kritik olan uçtur: w_kal = 1 (saf kalıntı) PR-AUC'yi 0,553'e düşürmektedir. Ham modele verilen yalnızca %5'lik ağırlık başarımı 0,553'ten 0,780'e taşımaktadır (+0,227). Bu, birleşimin kozmetik değil işlevsel olduğunun sayısal kanıtıdır.</w:t>
+      </w:r>
+    </w:p>
+    <w:p>
+      <w:r>
+        <w:t>Uç noktalar özellikle önemlidir: w_kal = 0,98'de PR-AUC 0,718'e, 0,99'da 0,621'e, 1,00'da 0,553'e düşmektedir. Bildirinin seçtiği 0,95, bu uçurumun hemen öncesindeki omuzda oturmaktadır — ham modelin katkısı küçük bir ağırlıkla alınmakta, fakat sıfırlanmamaktadır.</w:t>
       </w:r>
     </w:p>
     <w:p>
@@ -18886,16 +19499,16 @@
         <w:t>dururken</w:t>
       </w:r>
       <w:r>
-        <w:t xml:space="preserve"> başlatılmıştır. Uyarlanabilir taban çizgisi 10 saniyelik hareketsiz gürültüden öğrenilmiş ve eşik 0,0103'te oturmuştur. Robot hareket etmeye başladığında skor anında 0,34'e çıkmış, eşiği aşmış ve alarmı kilitlemiştir. Alarm sürerken taban çizgisi donduğu için eşik bir daha güncellenememiş; sonuç 292 saniye süren </w:t>
+        <w:t xml:space="preserve"> başlatılmıştır. Uyarlanabilir taban çizgisi 10 saniyelik hareketsiz gürültüden öğrenilmiş ve eşik 0,0103'te oturmuştur. Robot hareket etmeye başladığında skor anında 0,34'e çıkmış, eşiği aşmış ve alarmı kilitlemiştir. Alarm sürerken taban çizgisi donduğu için eşik bir daha güncellenememiş; sonuç kayıt sonuna kadar hiç açılmayan, </w:t>
       </w:r>
       <w:r>
         <w:rPr>
           <w:b/>
         </w:rPr>
-        <w:t>tek bir alarm bloğu</w:t>
-      </w:r>
-      <w:r>
-        <w:t xml:space="preserve"> olmuştur.</w:t>
+        <w:t>564 saniyelik tek bir alarm bloğu</w:t>
+      </w:r>
+      <w:r>
+        <w:t xml:space="preserve"> olmuştur — 620 saniyelik koşunun %91'i.</w:t>
       </w:r>
     </w:p>
     <w:p>
@@ -19022,7 +19635,7 @@
               <w:rPr>
                 <w:sz w:val="18"/>
               </w:rPr>
-              <w:t>hareketsiz</w:t>
+              <w:t>hareketsiz (katlanmış poz)</w:t>
             </w:r>
           </w:p>
         </w:tc>
@@ -19040,7 +19653,7 @@
               <w:rPr>
                 <w:sz w:val="18"/>
               </w:rPr>
-              <w:t>1.031</w:t>
+              <w:t>1.114</w:t>
             </w:r>
           </w:p>
         </w:tc>
@@ -19076,7 +19689,7 @@
               <w:rPr>
                 <w:sz w:val="18"/>
               </w:rPr>
-              <w:t>0,0065</w:t>
+              <w:t>0,0068</w:t>
             </w:r>
           </w:p>
         </w:tc>
@@ -19114,7 +19727,7 @@
               <w:rPr>
                 <w:sz w:val="18"/>
               </w:rPr>
-              <w:t>4.515</w:t>
+              <w:t>2.884</w:t>
             </w:r>
           </w:p>
         </w:tc>
@@ -19132,7 +19745,7 @@
               <w:rPr>
                 <w:sz w:val="18"/>
               </w:rPr>
-              <w:t>1,4866</w:t>
+              <w:t>1,4532</w:t>
             </w:r>
           </w:p>
         </w:tc>
@@ -19150,7 +19763,7 @@
               <w:rPr>
                 <w:sz w:val="18"/>
               </w:rPr>
-              <w:t>6,8786</w:t>
+              <w:t>6,4341</w:t>
             </w:r>
           </w:p>
         </w:tc>
@@ -19200,7 +19813,7 @@
                 <w:b/>
                 <w:sz w:val="18"/>
               </w:rPr>
-              <w:t>220</w:t>
+              <w:t>219</w:t>
             </w:r>
           </w:p>
         </w:tc>
@@ -19224,7 +19837,7 @@
                 <w:b/>
                 <w:sz w:val="18"/>
               </w:rPr>
-              <w:t>2,8012</w:t>
+              <w:t>2,8136</w:t>
             </w:r>
           </w:p>
         </w:tc>
@@ -19268,7 +19881,7 @@
               <w:rPr>
                 <w:sz w:val="18"/>
               </w:rPr>
-              <w:t>koruyucu durdurma sonrası</w:t>
+              <w:t>koruyucu durdurma</w:t>
             </w:r>
           </w:p>
         </w:tc>
@@ -19286,7 +19899,7 @@
               <w:rPr>
                 <w:sz w:val="18"/>
               </w:rPr>
-              <w:t>2.280</w:t>
+              <w:t>2.441</w:t>
             </w:r>
           </w:p>
         </w:tc>
@@ -19304,7 +19917,7 @@
               <w:rPr>
                 <w:sz w:val="18"/>
               </w:rPr>
-              <w:t>0,3151</w:t>
+              <w:t>0,3152</w:t>
             </w:r>
           </w:p>
         </w:tc>
@@ -19322,7 +19935,7 @@
               <w:rPr>
                 <w:sz w:val="18"/>
               </w:rPr>
-              <w:t>0,3834</w:t>
+              <w:t>0,9712</w:t>
             </w:r>
           </w:p>
         </w:tc>
@@ -19339,7 +19952,61 @@
           <w:color w:val="555F6B"/>
           <w:sz w:val="18"/>
         </w:rPr>
-        <w:t>Tablo 10.1. İlk koşunun rejimlere ayrılmış skor dağılımı. Sıkışma anı 348 saniyelik koşunun en yüksek değeridir; onu izleyen iki dakikalık düz seviye robotun koruyucu durdurmada beklediği süredir.</w:t>
+        <w:t>Tablo 10.1. İlk koşunun rejimlere ayrılmış skor dağılımı. Sıkışma anı 620 saniyelik koşunun en yüksek değeridir; onu izleyen 122 saniyelik düz seviye robotun koruyucu durdurmada beklediği süredir.</w:t>
+      </w:r>
+    </w:p>
+    <w:p>
+      <w:pPr>
+        <w:spacing w:before="120" w:after="40"/>
+        <w:jc w:val="center"/>
+      </w:pPr>
+      <w:r>
+        <w:drawing>
+          <wp:inline xmlns:a="http://schemas.openxmlformats.org/drawingml/2006/main" xmlns:pic="http://schemas.openxmlformats.org/drawingml/2006/picture">
+            <wp:extent cx="5760000" cy="3175050"/>
+            <wp:docPr id="5" name="Picture 5"/>
+            <wp:cNvGraphicFramePr>
+              <a:graphicFrameLocks noChangeAspect="1"/>
+            </wp:cNvGraphicFramePr>
+            <a:graphic>
+              <a:graphicData uri="http://schemas.openxmlformats.org/drawingml/2006/picture">
+                <pic:pic>
+                  <pic:nvPicPr>
+                    <pic:cNvPr id="0" name="sekil_kilit.png"/>
+                    <pic:cNvPicPr/>
+                  </pic:nvPicPr>
+                  <pic:blipFill>
+                    <a:blip r:embed="rId13"/>
+                    <a:stretch>
+                      <a:fillRect/>
+                    </a:stretch>
+                  </pic:blipFill>
+                  <pic:spPr>
+                    <a:xfrm>
+                      <a:off x="0" y="0"/>
+                      <a:ext cx="5760000" cy="3175050"/>
+                    </a:xfrm>
+                    <a:prstGeom prst="rect"/>
+                  </pic:spPr>
+                </pic:pic>
+              </a:graphicData>
+            </a:graphic>
+          </wp:inline>
+        </w:drawing>
+      </w:r>
+    </w:p>
+    <w:p>
+      <w:pPr>
+        <w:spacing w:after="240"/>
+        <w:jc w:val="center"/>
+      </w:pPr>
+      <w:r>
+        <w:rPr>
+          <w:i/>
+          <w:color w:val="555F6B"/>
+          <w:sz w:val="18"/>
+        </w:rPr>
+        <w:t>Şekil 10.1. Kilitlenmenin zaman çizelgesi (10:17 koşusu, logaritmik eksen). Uyarlanabilir eşik +56. saniyeden itibaren 0,0103'te donmuş, alarm kayıt sonuna kadar 564 saniye boyunca hiç açılmamıştır (pembe alan). Koşunun en yüksek değeri olan sıkışma tepesi (10,27) bu blok içinde kaldığı için ayrı bir olay kaydı üretmemiştir. Tepenin ardından gelen 122 saniyelik düz seviye, robotun koruyucu durdurmada beklediği süredir.</w:t>
       </w:r>
     </w:p>
     <w:p>
@@ -19438,6 +20105,60 @@
       </w:r>
       <w:r>
         <w:t xml:space="preserve"> bir offsettir ve poza bağlı bir hatayı telafi edemez. Bu, bir eşik sorunu değil model sadakati sorunudur; tek bir global eşik bu nedenle kalıcı olarak kırılgandır.</w:t>
+      </w:r>
+    </w:p>
+    <w:p>
+      <w:pPr>
+        <w:spacing w:before="120" w:after="40"/>
+        <w:jc w:val="center"/>
+      </w:pPr>
+      <w:r>
+        <w:drawing>
+          <wp:inline xmlns:a="http://schemas.openxmlformats.org/drawingml/2006/main" xmlns:pic="http://schemas.openxmlformats.org/drawingml/2006/picture">
+            <wp:extent cx="5760000" cy="3039275"/>
+            <wp:docPr id="6" name="Picture 6"/>
+            <wp:cNvGraphicFramePr>
+              <a:graphicFrameLocks noChangeAspect="1"/>
+            </wp:cNvGraphicFramePr>
+            <a:graphic>
+              <a:graphicData uri="http://schemas.openxmlformats.org/drawingml/2006/picture">
+                <pic:pic>
+                  <pic:nvPicPr>
+                    <pic:cNvPr id="0" name="sekil_rejim.png"/>
+                    <pic:cNvPicPr/>
+                  </pic:nvPicPr>
+                  <pic:blipFill>
+                    <a:blip r:embed="rId14"/>
+                    <a:stretch>
+                      <a:fillRect/>
+                    </a:stretch>
+                  </pic:blipFill>
+                  <pic:spPr>
+                    <a:xfrm>
+                      <a:off x="0" y="0"/>
+                      <a:ext cx="5760000" cy="3039275"/>
+                    </a:xfrm>
+                    <a:prstGeom prst="rect"/>
+                  </pic:spPr>
+                </pic:pic>
+              </a:graphicData>
+            </a:graphic>
+          </wp:inline>
+        </w:drawing>
+      </w:r>
+    </w:p>
+    <w:p>
+      <w:pPr>
+        <w:spacing w:after="240"/>
+        <w:jc w:val="center"/>
+      </w:pPr>
+      <w:r>
+        <w:rPr>
+          <w:i/>
+          <w:color w:val="555F6B"/>
+          <w:sz w:val="18"/>
+        </w:rPr>
+        <w:t>Şekil 10.2. Beş çalışma rejiminde birleşik skorun dağılımı (logaritmik eksen; nokta bulutu ham kararlar, kalın çizgi medyandır). Aynı robot ve aynı modellerle skor üç büyüklük mertebesi değişmektedir: katlanmış park pozunda 0,0037, koruyucu durdurmada 0,32, harekette 1,57, yerçekimi yüklü duruşta 4,41. FMU eşiği (kırmızı kesikli çizgi) rejimlerin üçünün **içinden** geçmektedir — tek bir global eşiğin neden kırılgan olduğu budur. Hareket / duruş ayrımı hareket bayrağı taşıyan 10:38 koşusundan, park pozu ile koruyucu durdurma platosu 10:17 koşusundan alınmıştır.</w:t>
       </w:r>
     </w:p>
     <w:p>
@@ -20167,6 +20888,60 @@
       </w:r>
     </w:p>
     <w:p>
+      <w:pPr>
+        <w:spacing w:before="120" w:after="40"/>
+        <w:jc w:val="center"/>
+      </w:pPr>
+      <w:r>
+        <w:drawing>
+          <wp:inline xmlns:a="http://schemas.openxmlformats.org/drawingml/2006/main" xmlns:pic="http://schemas.openxmlformats.org/drawingml/2006/picture">
+            <wp:extent cx="5760000" cy="3486179"/>
+            <wp:docPr id="7" name="Picture 7"/>
+            <wp:cNvGraphicFramePr>
+              <a:graphicFrameLocks noChangeAspect="1"/>
+            </wp:cNvGraphicFramePr>
+            <a:graphic>
+              <a:graphicData uri="http://schemas.openxmlformats.org/drawingml/2006/picture">
+                <pic:pic>
+                  <pic:nvPicPr>
+                    <pic:cNvPr id="0" name="sekil_esik.png"/>
+                    <pic:cNvPicPr/>
+                  </pic:nvPicPr>
+                  <pic:blipFill>
+                    <a:blip r:embed="rId15"/>
+                    <a:stretch>
+                      <a:fillRect/>
+                    </a:stretch>
+                  </pic:blipFill>
+                  <pic:spPr>
+                    <a:xfrm>
+                      <a:off x="0" y="0"/>
+                      <a:ext cx="5760000" cy="3486179"/>
+                    </a:xfrm>
+                    <a:prstGeom prst="rect"/>
+                  </pic:spPr>
+                </pic:pic>
+              </a:graphicData>
+            </a:graphic>
+          </wp:inline>
+        </w:drawing>
+      </w:r>
+    </w:p>
+    <w:p>
+      <w:pPr>
+        <w:spacing w:after="240"/>
+        <w:jc w:val="center"/>
+      </w:pPr>
+      <w:r>
+        <w:rPr>
+          <w:i/>
+          <w:color w:val="555F6B"/>
+          <w:sz w:val="18"/>
+        </w:rPr>
+        <w:t>Şekil 10.3. Eşik takasının iki yüzü, ortak logaritmik θ ekseninde. Üstte yakalanan gerçek olay sayısı, altta saat başına yanlış alarm. İki ölçüt kasıtlı olarak ayrı panellerde tutulmuştur; farklı birimleri tek eksende üst üste bindirmek yanıltıcı olurdu. θ = 18 (kırmızı kesikli çizgi) yanlış alarm oranını 38,7'den 6,7'ye düşürürken beş gerçek olaydan dördünü korumaktadır; 17,43'ün hemen üstünde oturması muayene çevriminin on altı periyodik alarmını birden susturan basamaktır.</w:t>
+      </w:r>
+    </w:p>
+    <w:p>
       <w:r>
         <w:t xml:space="preserve">Aynı etiketli küme üzerinde uyarlanabilir kural da yeniden sınanmıştır. k ∈ [8; 30] aralığında hiçbir değer doğrulanmış gerçek olayları yakalamamış, yalnızca temiz veriye yanlış blok eklemiştir. Sebebi ölçülmüştür: kuralın taban çizgisi normal hareketin ~6,4'lük tepelerini de yutmakta, MAD şişmekte ve eşik gerçek olayların üstüne çıkmaktadır. Gerçek robotta olayı yakalayan bileşen </w:t>
       </w:r>
@@ -20200,6 +20975,60 @@
       </w:r>
       <w:r>
         <w:t>. Muayene çevriminde alarm başlangıçları arası 60, 38, 59, 32, 60, 32, 59, 32 ve 60 saniyedir; her ~92 saniyelik çevrimde aynı üçlü örüntü (6,2 s / tepe ~17, ardından 3,0 s / tepe ~10,3, ardından 0,15 s / ~8,4) tekrarlanmaktadır. Aynı yörünge her seferinde aynı sıçramayı üretmektedir. Bu, modellerin gerçek yörüngeleri tanımadığının doğrudan kanıtıdır: FMU ile eğitilmiş özkodlayıcılar için gerçek muayene taraması dağıtım dışıdır.</w:t>
+      </w:r>
+    </w:p>
+    <w:p>
+      <w:pPr>
+        <w:spacing w:before="120" w:after="40"/>
+        <w:jc w:val="center"/>
+      </w:pPr>
+      <w:r>
+        <w:drawing>
+          <wp:inline xmlns:a="http://schemas.openxmlformats.org/drawingml/2006/main" xmlns:pic="http://schemas.openxmlformats.org/drawingml/2006/picture">
+            <wp:extent cx="5760000" cy="3085524"/>
+            <wp:docPr id="8" name="Picture 8"/>
+            <wp:cNvGraphicFramePr>
+              <a:graphicFrameLocks noChangeAspect="1"/>
+            </wp:cNvGraphicFramePr>
+            <a:graphic>
+              <a:graphicData uri="http://schemas.openxmlformats.org/drawingml/2006/picture">
+                <pic:pic>
+                  <pic:nvPicPr>
+                    <pic:cNvPr id="0" name="sekil_muayene.png"/>
+                    <pic:cNvPicPr/>
+                  </pic:nvPicPr>
+                  <pic:blipFill>
+                    <a:blip r:embed="rId16"/>
+                    <a:stretch>
+                      <a:fillRect/>
+                    </a:stretch>
+                  </pic:blipFill>
+                  <pic:spPr>
+                    <a:xfrm>
+                      <a:off x="0" y="0"/>
+                      <a:ext cx="5760000" cy="3085524"/>
+                    </a:xfrm>
+                    <a:prstGeom prst="rect"/>
+                  </pic:spPr>
+                </pic:pic>
+              </a:graphicData>
+            </a:graphic>
+          </wp:inline>
+        </w:drawing>
+      </w:r>
+    </w:p>
+    <w:p>
+      <w:pPr>
+        <w:spacing w:after="240"/>
+        <w:jc w:val="center"/>
+      </w:pPr>
+      <w:r>
+        <w:rPr>
+          <w:i/>
+          <w:color w:val="555F6B"/>
+          <w:sz w:val="18"/>
+        </w:rPr>
+        <w:t>Şekil 10.4. Muayene koşusunun tam skor izi. Beş ana tepe ≈92 saniyelik eşit aralıklarla tekrarlamakta ve her çevrimde aynı üçlü örüntü görünmektedir. Bu düzenlilik, alarmların ölçüm gürültüsü değil **yörüngenin kendisi** tarafından üretildiğini göstermektedir: aynı hareket her seferinde aynı sıçramayı vermektedir. Tepelerin tavanı 17,43'tür ve θ = 18 çizgisinin altında kalmaktadır.</w:t>
       </w:r>
     </w:p>
     <w:p>
@@ -20474,7 +21303,7 @@
               <w:rPr>
                 <w:sz w:val="18"/>
               </w:rPr>
-              <w:t>8,30</w:t>
+              <w:t>8,28</w:t>
             </w:r>
           </w:p>
         </w:tc>
@@ -20492,7 +21321,7 @@
               <w:rPr>
                 <w:sz w:val="18"/>
               </w:rPr>
-              <w:t>10,43</w:t>
+              <w:t>10,42</w:t>
             </w:r>
           </w:p>
         </w:tc>
@@ -20532,6 +21361,60 @@
     </w:p>
     <w:p>
       <w:pPr>
+        <w:spacing w:before="120" w:after="40"/>
+        <w:jc w:val="center"/>
+      </w:pPr>
+      <w:r>
+        <w:drawing>
+          <wp:inline xmlns:a="http://schemas.openxmlformats.org/drawingml/2006/main" xmlns:pic="http://schemas.openxmlformats.org/drawingml/2006/picture">
+            <wp:extent cx="5760000" cy="2544882"/>
+            <wp:docPr id="9" name="Picture 9"/>
+            <wp:cNvGraphicFramePr>
+              <a:graphicFrameLocks noChangeAspect="1"/>
+            </wp:cNvGraphicFramePr>
+            <a:graphic>
+              <a:graphicData uri="http://schemas.openxmlformats.org/drawingml/2006/picture">
+                <pic:pic>
+                  <pic:nvPicPr>
+                    <pic:cNvPr id="0" name="sekil_tepeler.png"/>
+                    <pic:cNvPicPr/>
+                  </pic:nvPicPr>
+                  <pic:blipFill>
+                    <a:blip r:embed="rId17"/>
+                    <a:stretch>
+                      <a:fillRect/>
+                    </a:stretch>
+                  </pic:blipFill>
+                  <pic:spPr>
+                    <a:xfrm>
+                      <a:off x="0" y="0"/>
+                      <a:ext cx="5760000" cy="2544882"/>
+                    </a:xfrm>
+                    <a:prstGeom prst="rect"/>
+                  </pic:spPr>
+                </pic:pic>
+              </a:graphicData>
+            </a:graphic>
+          </wp:inline>
+        </w:drawing>
+      </w:r>
+    </w:p>
+    <w:p>
+      <w:pPr>
+        <w:spacing w:after="240"/>
+        <w:jc w:val="center"/>
+      </w:pPr>
+      <w:r>
+        <w:rPr>
+          <w:i/>
+          <w:color w:val="555F6B"/>
+          <w:sz w:val="18"/>
+        </w:rPr>
+        <w:t>Şekil 10.5. Otuz dört etiketli olayın tepe skorları (logaritmik eksen). İki sınıf 8–90 aralığında örtüşmektedir. θ = 18 çizgisi yanlış alarmların yirmi dördünü elemekte, fakat en yüksek tepeli yanlış alarmı (90,55) durduramamaktadır — o tek vaka üç gerçek olaydan daha yüksek skorludur. Bu örtüşme bir eşik seçimiyle değil, ancak modellerin gerçek veriyle yeniden eğitilmesiyle kapanabilir.</w:t>
+      </w:r>
+    </w:p>
+    <w:p>
+      <w:pPr>
         <w:pStyle w:val="Heading2"/>
       </w:pPr>
       <w:r>
@@ -20596,12 +21479,748 @@
         <w:t>user_interface</w:t>
       </w:r>
       <w:r>
-        <w:t xml:space="preserve"> paketi, Flask + SocketIO) üçüncü bir sekme olarak entegre edilmiştir. Sekme, durum bandı (NORMAL / ANOMALİ), 60 saniyelik logaritmik eksenli canlı skor grafiği, iki modelin kendi eşiklerine oranını gösteren kırılım ve olay geçmişi tablosundan oluşmaktadır.</w:t>
+        <w:t xml:space="preserve"> paketi, Flask + SocketIO) </w:t>
+      </w:r>
+      <w:r>
+        <w:rPr>
+          <w:b/>
+        </w:rPr>
+        <w:t>Anomaly Detection</w:t>
+      </w:r>
+      <w:r>
+        <w:t xml:space="preserve"> adıyla üçüncü bir sekme olarak entegre edilmiştir. Sekme, gerçek robot çalışırken alınmış hâliyle Şekil 10.6'da görülmektedir.</w:t>
       </w:r>
     </w:p>
     <w:p>
-      <w:r>
-        <w:t xml:space="preserve">İki tasarım kararı doğrudan bu bölümdeki ölçümlerden gelmektedir. Birincisi, tabloda birincil sütun </w:t>
+      <w:pPr>
+        <w:spacing w:before="120" w:after="40"/>
+        <w:jc w:val="center"/>
+      </w:pPr>
+      <w:r>
+        <w:drawing>
+          <wp:inline xmlns:a="http://schemas.openxmlformats.org/drawingml/2006/main" xmlns:pic="http://schemas.openxmlformats.org/drawingml/2006/picture">
+            <wp:extent cx="5760000" cy="3240000"/>
+            <wp:docPr id="10" name="Picture 10"/>
+            <wp:cNvGraphicFramePr>
+              <a:graphicFrameLocks noChangeAspect="1"/>
+            </wp:cNvGraphicFramePr>
+            <a:graphic>
+              <a:graphicData uri="http://schemas.openxmlformats.org/drawingml/2006/picture">
+                <pic:pic>
+                  <pic:nvPicPr>
+                    <pic:cNvPr id="0" name="real_system.png"/>
+                    <pic:cNvPicPr/>
+                  </pic:nvPicPr>
+                  <pic:blipFill>
+                    <a:blip r:embed="rId18"/>
+                    <a:stretch>
+                      <a:fillRect/>
+                    </a:stretch>
+                  </pic:blipFill>
+                  <pic:spPr>
+                    <a:xfrm>
+                      <a:off x="0" y="0"/>
+                      <a:ext cx="5760000" cy="3240000"/>
+                    </a:xfrm>
+                    <a:prstGeom prst="rect"/>
+                  </pic:spPr>
+                </pic:pic>
+              </a:graphicData>
+            </a:graphic>
+          </wp:inline>
+        </w:drawing>
+      </w:r>
+    </w:p>
+    <w:p>
+      <w:pPr>
+        <w:spacing w:after="240"/>
+        <w:jc w:val="center"/>
+      </w:pPr>
+      <w:r>
+        <w:rPr>
+          <w:i/>
+          <w:color w:val="555F6B"/>
+          <w:sz w:val="18"/>
+        </w:rPr>
+        <w:t>Şekil 10.6. Gerçek UR10e'ye bağlı çalışan operatör arayüzü (21 Ağustos 2026, 15:22). Durum bandı NORMAL, karar hızı 20,0 Hz, çalışma eşiği θ = 18,00. Canlı grafikte görülen ~14'lük tepe eşiğin altında kalmış, dolayısıyla alarm üretilmemiştir. Sağdaki kırılım o an kararı ham modelin sürüklediğini göstermektedir (ham 5,60 / θ 3,45 = 1,62 kat; kalıntı 1,57 / θ 1,60 = 0,98 kat). Alt tabloda pick and place koşusunun olayları, tepe değerleri ve operatör etiketleri yer almaktadır; en üstteki 146,44 tepeli satır çarpışma olayıdır.</w:t>
+      </w:r>
+    </w:p>
+    <w:p>
+      <w:pPr>
+        <w:pStyle w:val="Heading3"/>
+      </w:pPr>
+      <w:r>
+        <w:t>10.7.1. Veri yolu ve ayrı yürütücü zorunluluğu</w:t>
+      </w:r>
+    </w:p>
+    <w:p>
+      <w:r>
+        <w:t xml:space="preserve">Pano tarafındaki </w:t>
+      </w:r>
+      <w:r>
+        <w:rPr>
+          <w:rFonts w:ascii="Consolas" w:hAnsi="Consolas"/>
+          <w:sz w:val="19"/>
+        </w:rPr>
+        <w:t>AnomalyCollector</w:t>
+      </w:r>
+      <w:r>
+        <w:t xml:space="preserve"> sınıfı dedektör düğümünün üç konusuna abone olur: </w:t>
+      </w:r>
+      <w:r>
+        <w:rPr>
+          <w:rFonts w:ascii="Consolas" w:hAnsi="Consolas"/>
+          <w:sz w:val="19"/>
+        </w:rPr>
+        <w:t>/ur10e_anomaly_detector/detail</w:t>
+      </w:r>
+      <w:r>
+        <w:t xml:space="preserve"> (karar başına tam kayıt), </w:t>
+      </w:r>
+      <w:r>
+        <w:rPr>
+          <w:rFonts w:ascii="Consolas" w:hAnsi="Consolas"/>
+          <w:sz w:val="19"/>
+        </w:rPr>
+        <w:t>.../detected</w:t>
+      </w:r>
+      <w:r>
+        <w:t xml:space="preserve"> (ikili alarm) ve </w:t>
+      </w:r>
+      <w:r>
+        <w:rPr>
+          <w:rFonts w:ascii="Consolas" w:hAnsi="Consolas"/>
+          <w:sz w:val="19"/>
+        </w:rPr>
+        <w:t>.../score</w:t>
+      </w:r>
+      <w:r>
+        <w:t xml:space="preserve">. Toplanan örnekler 60 saniyelik bir halka tamponda tutulur ve 5 Hz'de </w:t>
+      </w:r>
+      <w:r>
+        <w:rPr>
+          <w:rFonts w:ascii="Consolas" w:hAnsi="Consolas"/>
+          <w:sz w:val="19"/>
+        </w:rPr>
+        <w:t>anomaly_update</w:t>
+      </w:r>
+      <w:r>
+        <w:t xml:space="preserve"> olayı olarak tarayıcıya itilir; 240 noktadan uzun seriler itilmeden önce seyreltilir.</w:t>
+      </w:r>
+    </w:p>
+    <w:tbl>
+      <w:tblPr>
+        <w:tblStyle w:val="TableGrid"/>
+        <w:tblW w:type="auto" w:w="0"/>
+        <w:tblLook w:firstColumn="1" w:firstRow="1" w:lastColumn="0" w:lastRow="0" w:noHBand="0" w:noVBand="1" w:val="04A0"/>
+      </w:tblPr>
+      <w:tblGrid>
+        <w:gridCol w:w="9518"/>
+      </w:tblGrid>
+      <w:tr>
+        <w:tc>
+          <w:tcPr>
+            <w:tcW w:type="dxa" w:w="9518"/>
+            <w:shd w:val="clear" w:fill="F4F7F8"/>
+          </w:tcPr>
+          <w:p>
+            <w:pPr>
+              <w:spacing w:after="60"/>
+              <w:jc w:val="left"/>
+            </w:pPr>
+            <w:r/>
+            <w:r>
+              <w:rPr>
+                <w:b/>
+                <w:color w:val="0C5E66"/>
+                <w:sz w:val="20"/>
+              </w:rPr>
+              <w:t>Ölçülen tuzak — paylaşılan küresel yürütücü</w:t>
+            </w:r>
+          </w:p>
+          <w:p>
+            <w:pPr>
+              <w:spacing w:after="60"/>
+              <w:jc w:val="both"/>
+            </w:pPr>
+            <w:r>
+              <w:rPr>
+                <w:sz w:val="19"/>
+              </w:rPr>
+              <w:t xml:space="preserve">İlk sürümde her iki toplayıcı da </w:t>
+            </w:r>
+            <w:r>
+              <w:rPr>
+                <w:rFonts w:ascii="Consolas" w:hAnsi="Consolas"/>
+                <w:sz w:val="19"/>
+              </w:rPr>
+              <w:t>rclpy.spin_once(node)</w:t>
+            </w:r>
+            <w:r>
+              <w:rPr>
+                <w:sz w:val="19"/>
+              </w:rPr>
+              <w:t xml:space="preserve"> kullanıyordu. Bu çağrı düğümü </w:t>
+            </w:r>
+            <w:r>
+              <w:rPr>
+                <w:b/>
+                <w:sz w:val="19"/>
+              </w:rPr>
+              <w:t>küresel</w:t>
+            </w:r>
+            <w:r>
+              <w:rPr>
+                <w:sz w:val="19"/>
+              </w:rPr>
+              <w:t xml:space="preserve"> yürütücüye ekler ve sahipliği bir daha geri vermez. İki toplayıcı aynı küresel yürütücüye düştüğünde iki iş parçacığı aynı bekleme kümesi üzerinde yarışmakta, düğüm ROS grafiğinden kaybolmakta, abonelikler hiç veri almamakta ve </w:t>
+            </w:r>
+            <w:r>
+              <w:rPr>
+                <w:b/>
+                <w:sz w:val="19"/>
+              </w:rPr>
+              <w:t>hiçbir hata basılmamaktadır</w:t>
+            </w:r>
+            <w:r>
+              <w:rPr>
+                <w:sz w:val="19"/>
+              </w:rPr>
+              <w:t>.</w:t>
+            </w:r>
+          </w:p>
+          <w:p>
+            <w:pPr>
+              <w:spacing w:after="60"/>
+              <w:jc w:val="both"/>
+            </w:pPr>
+            <w:r>
+              <w:rPr>
+                <w:sz w:val="19"/>
+              </w:rPr>
+              <w:t xml:space="preserve">Belirti: </w:t>
+            </w:r>
+            <w:r>
+              <w:rPr>
+                <w:rFonts w:ascii="Consolas" w:hAnsi="Consolas"/>
+                <w:sz w:val="19"/>
+              </w:rPr>
+              <w:t>ros2 node list</w:t>
+            </w:r>
+            <w:r>
+              <w:rPr>
+                <w:sz w:val="19"/>
+              </w:rPr>
+              <w:t xml:space="preserve"> çıktısında </w:t>
+            </w:r>
+            <w:r>
+              <w:rPr>
+                <w:rFonts w:ascii="Consolas" w:hAnsi="Consolas"/>
+                <w:sz w:val="19"/>
+              </w:rPr>
+              <w:t>dashboard_anomaly_listener</w:t>
+            </w:r>
+            <w:r>
+              <w:rPr>
+                <w:sz w:val="19"/>
+              </w:rPr>
+              <w:t xml:space="preserve"> görünmüyor, abonelik sayısı sıfır, arayüz sessizce boş kalıyor.</w:t>
+            </w:r>
+          </w:p>
+          <w:p>
+            <w:pPr>
+              <w:spacing w:after="60"/>
+              <w:jc w:val="both"/>
+            </w:pPr>
+            <w:r>
+              <w:rPr>
+                <w:sz w:val="19"/>
+              </w:rPr>
+              <w:t xml:space="preserve">Çözüm: her toplayıcıya kendi </w:t>
+            </w:r>
+            <w:r>
+              <w:rPr>
+                <w:rFonts w:ascii="Consolas" w:hAnsi="Consolas"/>
+                <w:sz w:val="19"/>
+              </w:rPr>
+              <w:t>SingleThreadedExecutor</w:t>
+            </w:r>
+            <w:r>
+              <w:rPr>
+                <w:sz w:val="19"/>
+              </w:rPr>
+              <w:t xml:space="preserve"> örneği verilmiş, </w:t>
+            </w:r>
+            <w:r>
+              <w:rPr>
+                <w:rFonts w:ascii="Consolas" w:hAnsi="Consolas"/>
+                <w:sz w:val="19"/>
+              </w:rPr>
+              <w:t>rclpy.init()</w:t>
+            </w:r>
+            <w:r>
+              <w:rPr>
+                <w:sz w:val="19"/>
+              </w:rPr>
+              <w:t xml:space="preserve"> çağrısı korumaya alınmış (ikinci çağrı "rcl_init called while already initialized" ile düşüyordu) ve ikinci toplayıcıdaki </w:t>
+            </w:r>
+            <w:r>
+              <w:rPr>
+                <w:rFonts w:ascii="Consolas" w:hAnsi="Consolas"/>
+                <w:sz w:val="19"/>
+              </w:rPr>
+              <w:t>rclpy.shutdown()</w:t>
+            </w:r>
+            <w:r>
+              <w:rPr>
+                <w:sz w:val="19"/>
+              </w:rPr>
+              <w:t xml:space="preserve"> kaldırılmıştır — bağlam artık paylaşılmaktadır.</w:t>
+            </w:r>
+          </w:p>
+        </w:tc>
+      </w:tr>
+    </w:tbl>
+    <w:p>
+      <w:pPr>
+        <w:spacing w:after="40"/>
+      </w:pPr>
+    </w:p>
+    <w:p>
+      <w:pPr>
+        <w:pStyle w:val="Heading3"/>
+      </w:pPr>
+      <w:r>
+        <w:t>10.7.2. Görselleştirme kararları</w:t>
+      </w:r>
+    </w:p>
+    <w:p>
+      <w:r>
+        <w:t>Arayüzdeki her tasarım kararı bu bölümdeki ölçümlerden türetilmiştir; hiçbiri estetik tercih değildir.</w:t>
+      </w:r>
+    </w:p>
+    <w:tbl>
+      <w:tblPr>
+        <w:tblStyle w:val="TableGrid"/>
+        <w:tblW w:type="auto" w:w="0"/>
+        <w:jc w:val="center"/>
+        <w:tblLook w:firstColumn="1" w:firstRow="1" w:lastColumn="0" w:lastRow="0" w:noHBand="0" w:noVBand="1" w:val="04A0"/>
+      </w:tblPr>
+      <w:tblGrid>
+        <w:gridCol w:w="4759"/>
+        <w:gridCol w:w="4759"/>
+      </w:tblGrid>
+      <w:tr>
+        <w:tc>
+          <w:tcPr>
+            <w:tcW w:type="dxa" w:w="2948"/>
+            <w:shd w:val="clear" w:fill="E7EBEF"/>
+          </w:tcPr>
+          <w:p>
+            <w:pPr>
+              <w:spacing w:after="0"/>
+              <w:jc w:val="left"/>
+            </w:pPr>
+            <w:r/>
+            <w:r>
+              <w:rPr>
+                <w:b/>
+                <w:sz w:val="18"/>
+              </w:rPr>
+              <w:t>Karar</w:t>
+            </w:r>
+          </w:p>
+        </w:tc>
+        <w:tc>
+          <w:tcPr>
+            <w:tcW w:type="dxa" w:w="6236"/>
+            <w:shd w:val="clear" w:fill="E7EBEF"/>
+          </w:tcPr>
+          <w:p>
+            <w:pPr>
+              <w:spacing w:after="0"/>
+              <w:jc w:val="right"/>
+            </w:pPr>
+            <w:r/>
+            <w:r>
+              <w:rPr>
+                <w:b/>
+                <w:sz w:val="18"/>
+              </w:rPr>
+              <w:t>Gerekçe (ölçüm)</w:t>
+            </w:r>
+          </w:p>
+        </w:tc>
+      </w:tr>
+      <w:tr>
+        <w:tc>
+          <w:tcPr>
+            <w:tcW w:type="dxa" w:w="2948"/>
+          </w:tcPr>
+          <w:p>
+            <w:pPr>
+              <w:spacing w:after="0"/>
+              <w:jc w:val="left"/>
+            </w:pPr>
+            <w:r/>
+            <w:r>
+              <w:rPr>
+                <w:sz w:val="18"/>
+              </w:rPr>
+              <w:t xml:space="preserve">Sayısal birleşik skor </w:t>
+            </w:r>
+            <w:r>
+              <w:rPr>
+                <w:b/>
+                <w:sz w:val="18"/>
+              </w:rPr>
+              <w:t>gösterilmiyor</w:t>
+            </w:r>
+          </w:p>
+        </w:tc>
+        <w:tc>
+          <w:tcPr>
+            <w:tcW w:type="dxa" w:w="6236"/>
+          </w:tcPr>
+          <w:p>
+            <w:pPr>
+              <w:spacing w:after="0"/>
+              <w:jc w:val="right"/>
+            </w:pPr>
+            <w:r/>
+            <w:r>
+              <w:rPr>
+                <w:sz w:val="18"/>
+              </w:rPr>
+              <w:t>Yuva 5 Hz'de beslenirken dedektör 20 Hz'de karar vermektedir. Tek bir örneklenmiş değer gerçek sinyalin gerisinde kalmakta ve grafiğin yanında açıkça yanlış okunmaktadır. Tam seriyi grafik taşır, örnek başına kesin değeri ipucu kutusu verir.</w:t>
+            </w:r>
+          </w:p>
+        </w:tc>
+      </w:tr>
+      <w:tr>
+        <w:tc>
+          <w:tcPr>
+            <w:tcW w:type="dxa" w:w="2948"/>
+          </w:tcPr>
+          <w:p>
+            <w:pPr>
+              <w:spacing w:after="0"/>
+              <w:jc w:val="left"/>
+            </w:pPr>
+            <w:r/>
+            <w:r>
+              <w:rPr>
+                <w:sz w:val="18"/>
+              </w:rPr>
+              <w:t>Doğrusal 0–30 eksen, gerektiğinde büyüyen</w:t>
+            </w:r>
+          </w:p>
+        </w:tc>
+        <w:tc>
+          <w:tcPr>
+            <w:tcW w:type="dxa" w:w="6236"/>
+          </w:tcPr>
+          <w:p>
+            <w:pPr>
+              <w:spacing w:after="0"/>
+              <w:jc w:val="right"/>
+            </w:pPr>
+            <w:r/>
+            <w:r>
+              <w:rPr>
+                <w:sz w:val="18"/>
+              </w:rPr>
+              <w:t>Normal çalışma ~1,3, eşik 18'dedir; bu aralık ikisini de ekranda tutar. Tepe 30'u aştığında eksen yuvarlak adımlarla (10 / 50 / 100) büyütülür, böylece kırpma da olmaz, eksen her karede nefes alıp vermez. Önceki logaritmik eksen, eşiğin üstündeki bölgeyi görsel olarak ezdiği için bırakılmıştır.</w:t>
+            </w:r>
+          </w:p>
+        </w:tc>
+      </w:tr>
+      <w:tr>
+        <w:tc>
+          <w:tcPr>
+            <w:tcW w:type="dxa" w:w="2948"/>
+          </w:tcPr>
+          <w:p>
+            <w:pPr>
+              <w:spacing w:after="0"/>
+              <w:jc w:val="left"/>
+            </w:pPr>
+            <w:r/>
+            <w:r>
+              <w:rPr>
+                <w:sz w:val="18"/>
+              </w:rPr>
+              <w:t>İşaretçi yalnız eşiğin üstünde</w:t>
+            </w:r>
+          </w:p>
+        </w:tc>
+        <w:tc>
+          <w:tcPr>
+            <w:tcW w:type="dxa" w:w="6236"/>
+          </w:tcPr>
+          <w:p>
+            <w:pPr>
+              <w:spacing w:after="0"/>
+              <w:jc w:val="right"/>
+            </w:pPr>
+            <w:r/>
+            <w:r>
+              <w:rPr>
+                <w:sz w:val="18"/>
+              </w:rPr>
+              <w:t>Kırmızı nokta yalnızca birleşik skoru θ'yı aşan örneklere konur. İncelenmeye değer örnekler bunlardır ve bir bakışta bulunabilir kalırlar.</w:t>
+            </w:r>
+          </w:p>
+        </w:tc>
+      </w:tr>
+      <w:tr>
+        <w:tc>
+          <w:tcPr>
+            <w:tcW w:type="dxa" w:w="2948"/>
+          </w:tcPr>
+          <w:p>
+            <w:pPr>
+              <w:spacing w:after="0"/>
+              <w:jc w:val="left"/>
+            </w:pPr>
+            <w:r/>
+            <w:r>
+              <w:rPr>
+                <w:sz w:val="18"/>
+              </w:rPr>
+              <w:t>İpucu kutusu tam karar kaydını taşır</w:t>
+            </w:r>
+          </w:p>
+        </w:tc>
+        <w:tc>
+          <w:tcPr>
+            <w:tcW w:type="dxa" w:w="6236"/>
+          </w:tcPr>
+          <w:p>
+            <w:pPr>
+              <w:spacing w:after="0"/>
+              <w:jc w:val="right"/>
+            </w:pPr>
+            <w:r/>
+            <w:r>
+              <w:rPr>
+                <w:sz w:val="18"/>
+              </w:rPr>
+              <w:t>Operatörün bir tepeyi grafikten ayrılmadan yargılayabilmesi için alt skorlar (kendi eşikleriyle), tetiklenen kurallar, hareket durumu ve |q̇| tepesi gösterilir.</w:t>
+            </w:r>
+          </w:p>
+        </w:tc>
+      </w:tr>
+      <w:tr>
+        <w:tc>
+          <w:tcPr>
+            <w:tcW w:type="dxa" w:w="2948"/>
+          </w:tcPr>
+          <w:p>
+            <w:pPr>
+              <w:spacing w:after="0"/>
+              <w:jc w:val="left"/>
+            </w:pPr>
+            <w:r/>
+            <w:r>
+              <w:rPr>
+                <w:sz w:val="18"/>
+              </w:rPr>
+              <w:t>Alarm kenar olarak mandallanıyor (≥ 5 s)</w:t>
+            </w:r>
+          </w:p>
+        </w:tc>
+        <w:tc>
+          <w:tcPr>
+            <w:tcW w:type="dxa" w:w="6236"/>
+          </w:tcPr>
+          <w:p>
+            <w:pPr>
+              <w:spacing w:after="0"/>
+              <w:jc w:val="right"/>
+            </w:pPr>
+            <w:r/>
+            <w:r>
+              <w:rPr>
+                <w:sz w:val="18"/>
+              </w:rPr>
+              <w:t xml:space="preserve">Kayıttaki en net gerçek olay (pick and place çarpışması, tepe 146,4) yalnız </w:t>
+            </w:r>
+            <w:r>
+              <w:rPr>
+                <w:b/>
+                <w:sz w:val="18"/>
+              </w:rPr>
+              <w:t>0,25 saniye</w:t>
+            </w:r>
+            <w:r>
+              <w:rPr>
+                <w:sz w:val="18"/>
+              </w:rPr>
+              <w:t xml:space="preserve"> sürmüştür — beş karar. 5 Hz'de seviye örneklemesi bu olayı tamamen kaçırmaktadır. Sahte 0,25 s'lik alarmlarla yapılan ölçümde kenar yakalama dört olayın dördünü, seviye örnekleme yalnız ikisini görmüştür.</w:t>
+            </w:r>
+          </w:p>
+        </w:tc>
+      </w:tr>
+      <w:tr>
+        <w:tc>
+          <w:tcPr>
+            <w:tcW w:type="dxa" w:w="2948"/>
+          </w:tcPr>
+          <w:p>
+            <w:pPr>
+              <w:spacing w:after="0"/>
+              <w:jc w:val="left"/>
+            </w:pPr>
+            <w:r/>
+            <w:r>
+              <w:rPr>
+                <w:sz w:val="18"/>
+              </w:rPr>
+              <w:t>Yuva dinleyicisi sekmeden bağımsız</w:t>
+            </w:r>
+          </w:p>
+        </w:tc>
+        <w:tc>
+          <w:tcPr>
+            <w:tcW w:type="dxa" w:w="6236"/>
+          </w:tcPr>
+          <w:p>
+            <w:pPr>
+              <w:spacing w:after="0"/>
+              <w:jc w:val="right"/>
+            </w:pPr>
+            <w:r/>
+            <w:r>
+              <w:rPr>
+                <w:sz w:val="18"/>
+              </w:rPr>
+              <w:t>Operatör başka sekmedeyken tetiklenen alarmın da mandala ve olay tablosuna ulaşması gerekmektedir; dinleyici sekme açılmasını beklemeden bağlanır.</w:t>
+            </w:r>
+          </w:p>
+        </w:tc>
+      </w:tr>
+    </w:tbl>
+    <w:p>
+      <w:pPr>
+        <w:spacing w:before="60" w:after="240"/>
+        <w:jc w:val="left"/>
+      </w:pPr>
+      <w:r>
+        <w:rPr>
+          <w:i/>
+          <w:color w:val="555F6B"/>
+          <w:sz w:val="18"/>
+        </w:rPr>
+        <w:t>Tablo 10.4. Arayüz tasarım kararları ve dayandıkları ölçümler.</w:t>
+      </w:r>
+    </w:p>
+    <w:p>
+      <w:r>
+        <w:t xml:space="preserve">Durum bandı dört durum alır: bağlantı yokken </w:t>
+      </w:r>
+      <w:r>
+        <w:rPr>
+          <w:b/>
+        </w:rPr>
+        <w:t>WAITING</w:t>
+      </w:r>
+      <w:r>
+        <w:t xml:space="preserve">, normal çalışmada </w:t>
+      </w:r>
+      <w:r>
+        <w:rPr>
+          <w:b/>
+        </w:rPr>
+        <w:t>NORMAL</w:t>
+      </w:r>
+      <w:r>
+        <w:t xml:space="preserve">, alarm sürerken </w:t>
+      </w:r>
+      <w:r>
+        <w:rPr>
+          <w:b/>
+        </w:rPr>
+        <w:t>ANOMALY</w:t>
+      </w:r>
+      <w:r>
+        <w:t xml:space="preserve"> ve mandal penceresi devam ederken </w:t>
+      </w:r>
+      <w:r>
+        <w:rPr>
+          <w:b/>
+        </w:rPr>
+        <w:t>ANOMALY (ended)</w:t>
+      </w:r>
+      <w:r>
+        <w:t>. Son duruma geçildiği anda olay tablosu bir kez yenilenir (en fazla üç saniyede bir), böylece operatör olayı kapanır kapanmaz etiketleyebilmektedir.</w:t>
+      </w:r>
+    </w:p>
+    <w:p>
+      <w:pPr>
+        <w:pStyle w:val="Heading3"/>
+      </w:pPr>
+      <w:r>
+        <w:t>10.7.3. Olay tablosu ve operatör etiketlemesi</w:t>
+      </w:r>
+    </w:p>
+    <w:p>
+      <w:r>
+        <w:t xml:space="preserve">Tablo, dedektörün yazdığı </w:t>
+      </w:r>
+      <w:r>
+        <w:rPr>
+          <w:rFonts w:ascii="Consolas" w:hAnsi="Consolas"/>
+          <w:sz w:val="19"/>
+        </w:rPr>
+        <w:t>olaylar_*.jsonl</w:t>
+      </w:r>
+      <w:r>
+        <w:t xml:space="preserve"> dosyalarını okuyan </w:t>
+      </w:r>
+      <w:r>
+        <w:rPr>
+          <w:rFonts w:ascii="Consolas" w:hAnsi="Consolas"/>
+          <w:sz w:val="19"/>
+        </w:rPr>
+        <w:t>/api/anomaly/events</w:t>
+      </w:r>
+      <w:r>
+        <w:t xml:space="preserve"> uç noktasından beslenir. Uç nokta </w:t>
+      </w:r>
+      <w:r>
+        <w:rPr>
+          <w:rFonts w:ascii="Consolas" w:hAnsi="Consolas"/>
+          <w:sz w:val="19"/>
+        </w:rPr>
+        <w:t>anomali_basladi</w:t>
+      </w:r>
+      <w:r>
+        <w:t xml:space="preserve"> ve </w:t>
+      </w:r>
+      <w:r>
+        <w:rPr>
+          <w:rFonts w:ascii="Consolas" w:hAnsi="Consolas"/>
+          <w:sz w:val="19"/>
+        </w:rPr>
+        <w:t>anomali_bitti</w:t>
+      </w:r>
+      <w:r>
+        <w:t xml:space="preserve"> kayıtlarını sıra numarası üzerinden eşleştirir; </w:t>
+      </w:r>
+      <w:r>
+        <w:rPr>
+          <w:b/>
+        </w:rPr>
+        <w:t>tepe değeri yalnız bitiş kaydında bulunduğu için bu eşleştirme zorunludur</w:t>
+      </w:r>
+      <w:r>
+        <w:t>. Kapanmamış bir olayda tepe yerine giriş değeri gösterilir ve satır sürüyor olarak işaretlenir.</w:t>
+      </w:r>
+    </w:p>
+    <w:p>
+      <w:r>
+        <w:t xml:space="preserve">Tablodaki birincil sütun </w:t>
       </w:r>
       <w:r>
         <w:rPr>
@@ -20610,19 +22229,28 @@
         <w:t>tepe</w:t>
       </w:r>
       <w:r>
-        <w:t xml:space="preserve"> değeridir; giriş değeri ikincil gösterilir, çünkü giriş değerine bakıp tepeyi görmemek yanlış yoruma yol açmaktadır (8,5 giriş / 90,55 tepe). İkincisi, alarm hem sunucu tarafında kenar olarak yakalanmakta hem de arayüzde en az beş saniye mandallanmaktadır; 5 Hz'lik bir güncelleme hızında 0,25 saniyelik bir olay aksi hâlde ekrana hiç yansımamaktadır. Sahte 0,25 s'lik alarmlarla yapılan ölçümde kenar yakalama dört olayın dördünü, seviye örnekleme yalnız ikisini görmüştür.</w:t>
+        <w:t xml:space="preserve"> değeridir; giriş değeri ikincil gösterilir. Bu sıralama doğrudan 21 Ağustos ölçümünden gelmektedir: giriş değerine (8,5) bakıp tepeyi (90,55) görmemek olayın yanlış yorumlanmasına yol açmıştır. Tepesi </w:t>
+      </w:r>
+      <w:r>
+        <w:rPr>
+          <w:b/>
+        </w:rPr>
+        <w:t>31,98</w:t>
+      </w:r>
+      <w:r>
+        <w:t>'in — doğrulanmış en zayıf gerçek olayın — üstünde kalan satırlar ayrıca vurgulanır.</w:t>
       </w:r>
     </w:p>
     <w:p>
       <w:r>
-        <w:t xml:space="preserve">Tablodaki her satırda operatör için </w:t>
+        <w:t xml:space="preserve">Her satırda </w:t>
       </w:r>
       <w:r>
         <w:rPr>
           <w:rFonts w:ascii="Consolas" w:hAnsi="Consolas"/>
           <w:sz w:val="19"/>
         </w:rPr>
-        <w:t>Gerçek</w:t>
+        <w:t>True</w:t>
       </w:r>
       <w:r>
         <w:t xml:space="preserve"> / </w:t>
@@ -20632,7 +22260,7 @@
           <w:rFonts w:ascii="Consolas" w:hAnsi="Consolas"/>
           <w:sz w:val="19"/>
         </w:rPr>
-        <w:t>Yanlış alarm</w:t>
+        <w:t>False</w:t>
       </w:r>
       <w:r>
         <w:t xml:space="preserve"> / </w:t>
@@ -20645,8 +22273,172 @@
         <w:t>?</w:t>
       </w:r>
       <w:r>
-        <w:t xml:space="preserve"> düğmeleri bulunmaktadır. Etiketler dedektörün kayıtlarına dokunmadan ayrı bir dosyaya yazılır ve modellerin gerçek veriyle yeniden eğitilmesi için gereken etiketli kümeyi biriktirir.</w:t>
-      </w:r>
+        <w:t xml:space="preserve"> düğmeleri bulunmaktadır. Etiketler dedektörün kayıtlarına hiç dokunmadan ayrı bir dosyaya (</w:t>
+      </w:r>
+      <w:r>
+        <w:rPr>
+          <w:rFonts w:ascii="Consolas" w:hAnsi="Consolas"/>
+          <w:sz w:val="19"/>
+        </w:rPr>
+        <w:t>~/anomali_kayit/etiketler.json</w:t>
+      </w:r>
+      <w:r>
+        <w:t>) atomik olarak yazılır ve başlıktaki sayaç etiketlenmiş/etiketlenmemiş dağılımını canlı gösterir. Biriken bu küme, Bölüm 11.4'te açık bırakılan model uyarlaması işinin girdisidir.</w:t>
+      </w:r>
+    </w:p>
+    <w:tbl>
+      <w:tblPr>
+        <w:tblStyle w:val="TableGrid"/>
+        <w:tblW w:type="auto" w:w="0"/>
+        <w:tblLook w:firstColumn="1" w:firstRow="1" w:lastColumn="0" w:lastRow="0" w:noHBand="0" w:noVBand="1" w:val="04A0"/>
+      </w:tblPr>
+      <w:tblGrid>
+        <w:gridCol w:w="9518"/>
+      </w:tblGrid>
+      <w:tr>
+        <w:tc>
+          <w:tcPr>
+            <w:tcW w:type="dxa" w:w="9518"/>
+            <w:shd w:val="clear" w:fill="F4F7F8"/>
+          </w:tcPr>
+          <w:p>
+            <w:pPr>
+              <w:spacing w:after="60"/>
+              <w:jc w:val="left"/>
+            </w:pPr>
+            <w:r/>
+            <w:r>
+              <w:rPr>
+                <w:b/>
+                <w:color w:val="0C5E66"/>
+                <w:sz w:val="20"/>
+              </w:rPr>
+              <w:t>Dil ayrımı — arayüz İngilizce, disk Türkçe</w:t>
+            </w:r>
+          </w:p>
+          <w:p>
+            <w:pPr>
+              <w:spacing w:after="60"/>
+              <w:jc w:val="both"/>
+            </w:pPr>
+            <w:r>
+              <w:rPr>
+                <w:sz w:val="19"/>
+              </w:rPr>
+              <w:t>Operatörün gördüğü her metin İngilizcedir. Buna karşılık disk üzerindeki JSON anahtarları (</w:t>
+            </w:r>
+            <w:r>
+              <w:rPr>
+                <w:rFonts w:ascii="Consolas" w:hAnsi="Consolas"/>
+                <w:sz w:val="19"/>
+              </w:rPr>
+              <w:t>zaman</w:t>
+            </w:r>
+            <w:r>
+              <w:rPr>
+                <w:sz w:val="19"/>
+              </w:rPr>
+              <w:t xml:space="preserve">, </w:t>
+            </w:r>
+            <w:r>
+              <w:rPr>
+                <w:rFonts w:ascii="Consolas" w:hAnsi="Consolas"/>
+                <w:sz w:val="19"/>
+              </w:rPr>
+              <w:t>tepe</w:t>
+            </w:r>
+            <w:r>
+              <w:rPr>
+                <w:sz w:val="19"/>
+              </w:rPr>
+              <w:t xml:space="preserve">, </w:t>
+            </w:r>
+            <w:r>
+              <w:rPr>
+                <w:rFonts w:ascii="Consolas" w:hAnsi="Consolas"/>
+                <w:sz w:val="19"/>
+              </w:rPr>
+              <w:t>giris</w:t>
+            </w:r>
+            <w:r>
+              <w:rPr>
+                <w:sz w:val="19"/>
+              </w:rPr>
+              <w:t xml:space="preserve">, </w:t>
+            </w:r>
+            <w:r>
+              <w:rPr>
+                <w:rFonts w:ascii="Consolas" w:hAnsi="Consolas"/>
+                <w:sz w:val="19"/>
+              </w:rPr>
+              <w:t>etiket</w:t>
+            </w:r>
+            <w:r>
+              <w:rPr>
+                <w:sz w:val="19"/>
+              </w:rPr>
+              <w:t xml:space="preserve">, </w:t>
+            </w:r>
+            <w:r>
+              <w:rPr>
+                <w:rFonts w:ascii="Consolas" w:hAnsi="Consolas"/>
+                <w:sz w:val="19"/>
+              </w:rPr>
+              <w:t>gercek</w:t>
+            </w:r>
+            <w:r>
+              <w:rPr>
+                <w:sz w:val="19"/>
+              </w:rPr>
+              <w:t xml:space="preserve"> / </w:t>
+            </w:r>
+            <w:r>
+              <w:rPr>
+                <w:rFonts w:ascii="Consolas" w:hAnsi="Consolas"/>
+                <w:sz w:val="19"/>
+              </w:rPr>
+              <w:t>yanlis</w:t>
+            </w:r>
+            <w:r>
+              <w:rPr>
+                <w:sz w:val="19"/>
+              </w:rPr>
+              <w:t xml:space="preserve">) Türkçe kalmıştır: bunlar dedektör düğümünün yazdığı </w:t>
+            </w:r>
+            <w:r>
+              <w:rPr>
+                <w:b/>
+                <w:sz w:val="19"/>
+              </w:rPr>
+              <w:t>tel biçimidir</w:t>
+            </w:r>
+            <w:r>
+              <w:rPr>
+                <w:sz w:val="19"/>
+              </w:rPr>
+              <w:t xml:space="preserve">, arayüz metni değil. Yeniden adlandırılmaları hem mevcut kayıt dosyalarını hem de </w:t>
+            </w:r>
+            <w:r>
+              <w:rPr>
+                <w:rFonts w:ascii="Consolas" w:hAnsi="Consolas"/>
+                <w:sz w:val="19"/>
+              </w:rPr>
+              <w:t>etiketler.json</w:t>
+            </w:r>
+            <w:r>
+              <w:rPr>
+                <w:sz w:val="19"/>
+              </w:rPr>
+              <w:t xml:space="preserve"> içindeki birikmiş etiketleri geçersiz kılardı.</w:t>
+            </w:r>
+          </w:p>
+        </w:tc>
+      </w:tr>
+    </w:tbl>
+    <w:p>
+      <w:pPr>
+        <w:spacing w:after="40"/>
+      </w:pPr>
     </w:p>
     <w:p>
       <w:pPr>
@@ -21006,6 +22798,143 @@
     </w:p>
     <w:p>
       <w:r>
+        <w:t>Dedektör ayrıca hücrenin ana başlatma dosyasına gömülmüştür; ayrıca elle başlatılması gerekmez:</w:t>
+      </w:r>
+    </w:p>
+    <w:p>
+      <w:pPr>
+        <w:spacing w:before="80" w:after="160" w:line="240" w:lineRule="auto"/>
+        <w:ind w:left="227"/>
+        <w:jc w:val="left"/>
+        <w:shd w:val="clear" w:fill="F2F4F7"/>
+      </w:pPr>
+      <w:r>
+        <w:rPr>
+          <w:rFonts w:ascii="Consolas" w:hAnsi="Consolas"/>
+          <w:sz w:val="17"/>
+        </w:rPr>
+        <w:t># hücre ayağa kalktıktan 30 s sonra dedektör de başlar (varsayılan):</w:t>
+        <w:br/>
+        <w:t>ros2 launch my_robot_cell_control hil_test_whole_unified.launch.py</w:t>
+        <w:br/>
+        <w:br/>
+        <w:t># yalnız hücre, dedektör olmadan:</w:t>
+        <w:br/>
+        <w:t>ros2 launch my_robot_cell_control hil_test_whole_unified.launch.py \</w:t>
+        <w:br/>
+        <w:t xml:space="preserve">     use_anomaly_detection:=false</w:t>
+      </w:r>
+    </w:p>
+    <w:tbl>
+      <w:tblPr>
+        <w:tblStyle w:val="TableGrid"/>
+        <w:tblW w:type="auto" w:w="0"/>
+        <w:tblLook w:firstColumn="1" w:firstRow="1" w:lastColumn="0" w:lastRow="0" w:noHBand="0" w:noVBand="1" w:val="04A0"/>
+      </w:tblPr>
+      <w:tblGrid>
+        <w:gridCol w:w="9518"/>
+      </w:tblGrid>
+      <w:tr>
+        <w:tc>
+          <w:tcPr>
+            <w:tcW w:type="dxa" w:w="9518"/>
+            <w:shd w:val="clear" w:fill="F4F7F8"/>
+          </w:tcPr>
+          <w:p>
+            <w:pPr>
+              <w:spacing w:after="60"/>
+              <w:jc w:val="left"/>
+            </w:pPr>
+            <w:r/>
+            <w:r>
+              <w:rPr>
+                <w:b/>
+                <w:color w:val="0C5E66"/>
+                <w:sz w:val="20"/>
+              </w:rPr>
+              <w:t>Sahte donanımda dedektör bilerek başlatılmaz</w:t>
+            </w:r>
+          </w:p>
+          <w:p>
+            <w:pPr>
+              <w:spacing w:after="60"/>
+              <w:jc w:val="both"/>
+            </w:pPr>
+            <w:r>
+              <w:rPr>
+                <w:rFonts w:ascii="Consolas" w:hAnsi="Consolas"/>
+                <w:sz w:val="19"/>
+              </w:rPr>
+              <w:t>use_fake_hardware:=true</w:t>
+            </w:r>
+            <w:r>
+              <w:rPr>
+                <w:sz w:val="19"/>
+              </w:rPr>
+              <w:t xml:space="preserve"> iken </w:t>
+            </w:r>
+            <w:r>
+              <w:rPr>
+                <w:rFonts w:ascii="Consolas" w:hAnsi="Consolas"/>
+                <w:sz w:val="19"/>
+              </w:rPr>
+              <w:t>use_anomaly_detection</w:t>
+            </w:r>
+            <w:r>
+              <w:rPr>
+                <w:sz w:val="19"/>
+              </w:rPr>
+              <w:t xml:space="preserve"> değeri ne olursa olsun dedektör başlatılmaz; bunun yerine başlatma dosyası nedenini açıklayan bir günlük satırı basar.</w:t>
+            </w:r>
+          </w:p>
+          <w:p>
+            <w:pPr>
+              <w:spacing w:after="60"/>
+              <w:jc w:val="both"/>
+            </w:pPr>
+            <w:r>
+              <w:rPr>
+                <w:sz w:val="19"/>
+              </w:rPr>
+              <w:t xml:space="preserve">Gerekçe ölçülmüştür: kalıntı ayrıştırmasının tamamı </w:t>
+            </w:r>
+            <w:r>
+              <w:rPr>
+                <w:rFonts w:ascii="Consolas" w:hAnsi="Consolas"/>
+                <w:sz w:val="19"/>
+              </w:rPr>
+              <w:t>effort</w:t>
+            </w:r>
+            <w:r>
+              <w:rPr>
+                <w:sz w:val="19"/>
+              </w:rPr>
+              <w:t xml:space="preserve"> alanının </w:t>
+            </w:r>
+            <w:r>
+              <w:rPr>
+                <w:b/>
+                <w:sz w:val="19"/>
+              </w:rPr>
+              <w:t>gerçek motor akımı</w:t>
+            </w:r>
+            <w:r>
+              <w:rPr>
+                <w:sz w:val="19"/>
+              </w:rPr>
+              <w:t xml:space="preserve"> olmasına dayanır (Bölüm 10.1). Sahte donanım sürücüsü bu alanı komut değerinden türetir, dolayısıyla τ_ölçülen − τ̂_model farkı fiziksel bir anlam taşımaz ve üretilen skorlar yorumlanamaz.</w:t>
+            </w:r>
+          </w:p>
+        </w:tc>
+      </w:tr>
+    </w:tbl>
+    <w:p>
+      <w:pPr>
+        <w:spacing w:after="40"/>
+      </w:pPr>
+    </w:p>
+    <w:p>
+      <w:r>
         <w:t xml:space="preserve">Gömülü eşik </w:t>
       </w:r>
       <w:r>
@@ -22056,6 +23985,442 @@
           <w:sz w:val="18"/>
         </w:rPr>
         <w:t>Tablo 13.1. Yazılım envanteri. Çevrimdışı hat 3.176 satırdır ve depo dışında tutulmaktadır; kurulan ROS 2 paketi 1.050 satır kod ile model, kalibrasyon ve çözücü varlıklarından oluşan 13 MB'lık bir dağıtımdır.</w:t>
+      </w:r>
+    </w:p>
+    <w:p>
+      <w:r>
+        <w:t xml:space="preserve">Rapordaki bütün şekiller </w:t>
+      </w:r>
+      <w:r>
+        <w:rPr>
+          <w:rFonts w:ascii="Consolas" w:hAnsi="Consolas"/>
+          <w:sz w:val="19"/>
+        </w:rPr>
+        <w:t>docs/sekil_uret.py</w:t>
+      </w:r>
+      <w:r>
+        <w:t xml:space="preserve"> ile üretilmektedir; betik Bölüm 6 şekillerini </w:t>
+      </w:r>
+      <w:r>
+        <w:rPr>
+          <w:rFonts w:ascii="Consolas" w:hAnsi="Consolas"/>
+          <w:sz w:val="19"/>
+        </w:rPr>
+        <w:t>fusion_v2/scores.npz</w:t>
+      </w:r>
+      <w:r>
+        <w:t xml:space="preserve"> dosyasından, Bölüm 10 şekillerini </w:t>
+      </w:r>
+      <w:r>
+        <w:rPr>
+          <w:rFonts w:ascii="Consolas" w:hAnsi="Consolas"/>
+          <w:sz w:val="19"/>
+        </w:rPr>
+        <w:t>~/anomali_kayit</w:t>
+      </w:r>
+      <w:r>
+        <w:t xml:space="preserve"> altındaki ham kayıtlardan okur, dolayısıyla hiçbir sayı elle girilmemiştir:</w:t>
+      </w:r>
+    </w:p>
+    <w:p>
+      <w:pPr>
+        <w:spacing w:before="80" w:after="160" w:line="240" w:lineRule="auto"/>
+        <w:ind w:left="227"/>
+        <w:jc w:val="left"/>
+        <w:shd w:val="clear" w:fill="F2F4F7"/>
+      </w:pPr>
+      <w:r>
+        <w:rPr>
+          <w:rFonts w:ascii="Consolas" w:hAnsi="Consolas"/>
+          <w:sz w:val="17"/>
+        </w:rPr>
+        <w:t>python3 docs/sekil_uret.py     # -&gt; docs/figures/*.png</w:t>
+        <w:br/>
+        <w:t>python3 docs/rapor_uret.py     # -&gt; docs/UR10e_...Rapor.docx</w:t>
+      </w:r>
+    </w:p>
+    <w:p>
+      <w:r>
+        <w:t>Renkler bir veri görselleştirme referans paletinin ilk üç kategorik yuvasından alınmıştır; bu üçlü, renk körlüğü ayırt edilebilirliği için tüm-çift sınamasını geçmektedir. Kesinlik/duyarlılık gibi farklı birimli iki ölçüt hiçbir şekilde tek eksende üst üste bindirilmemiş, ayrı panellere ayrılmıştır (Şekil 10.3).</w:t>
+      </w:r>
+    </w:p>
+    <w:tbl>
+      <w:tblPr>
+        <w:tblStyle w:val="TableGrid"/>
+        <w:tblW w:type="auto" w:w="0"/>
+        <w:jc w:val="center"/>
+        <w:tblLook w:firstColumn="1" w:firstRow="1" w:lastColumn="0" w:lastRow="0" w:noHBand="0" w:noVBand="1" w:val="04A0"/>
+      </w:tblPr>
+      <w:tblGrid>
+        <w:gridCol w:w="3173"/>
+        <w:gridCol w:w="3173"/>
+        <w:gridCol w:w="3173"/>
+      </w:tblGrid>
+      <w:tr>
+        <w:tc>
+          <w:tcPr>
+            <w:tcW w:type="dxa" w:w="4195"/>
+            <w:shd w:val="clear" w:fill="E7EBEF"/>
+          </w:tcPr>
+          <w:p>
+            <w:pPr>
+              <w:spacing w:after="0"/>
+              <w:jc w:val="left"/>
+            </w:pPr>
+            <w:r/>
+            <w:r>
+              <w:rPr>
+                <w:b/>
+                <w:sz w:val="18"/>
+              </w:rPr>
+              <w:t>Dosya (`user_interface`)</w:t>
+            </w:r>
+          </w:p>
+        </w:tc>
+        <w:tc>
+          <w:tcPr>
+            <w:tcW w:type="dxa" w:w="1020"/>
+            <w:shd w:val="clear" w:fill="E7EBEF"/>
+          </w:tcPr>
+          <w:p>
+            <w:pPr>
+              <w:spacing w:after="0"/>
+              <w:jc w:val="right"/>
+            </w:pPr>
+            <w:r/>
+            <w:r>
+              <w:rPr>
+                <w:b/>
+                <w:sz w:val="18"/>
+              </w:rPr>
+              <w:t>Satır</w:t>
+            </w:r>
+          </w:p>
+        </w:tc>
+        <w:tc>
+          <w:tcPr>
+            <w:tcW w:type="dxa" w:w="3515"/>
+            <w:shd w:val="clear" w:fill="E7EBEF"/>
+          </w:tcPr>
+          <w:p>
+            <w:pPr>
+              <w:spacing w:after="0"/>
+              <w:jc w:val="right"/>
+            </w:pPr>
+            <w:r/>
+            <w:r>
+              <w:rPr>
+                <w:b/>
+                <w:sz w:val="18"/>
+              </w:rPr>
+              <w:t>İşlev</w:t>
+            </w:r>
+          </w:p>
+        </w:tc>
+      </w:tr>
+      <w:tr>
+        <w:tc>
+          <w:tcPr>
+            <w:tcW w:type="dxa" w:w="4195"/>
+          </w:tcPr>
+          <w:p>
+            <w:pPr>
+              <w:spacing w:after="0"/>
+              <w:jc w:val="left"/>
+            </w:pPr>
+            <w:r/>
+            <w:r>
+              <w:rPr>
+                <w:rFonts w:ascii="Consolas" w:hAnsi="Consolas"/>
+                <w:sz w:val="18"/>
+              </w:rPr>
+              <w:t>app.py</w:t>
+            </w:r>
+            <w:r>
+              <w:rPr>
+                <w:sz w:val="18"/>
+              </w:rPr>
+              <w:t xml:space="preserve"> (579–819)</w:t>
+            </w:r>
+          </w:p>
+        </w:tc>
+        <w:tc>
+          <w:tcPr>
+            <w:tcW w:type="dxa" w:w="1020"/>
+          </w:tcPr>
+          <w:p>
+            <w:pPr>
+              <w:spacing w:after="0"/>
+              <w:jc w:val="right"/>
+            </w:pPr>
+            <w:r/>
+            <w:r>
+              <w:rPr>
+                <w:sz w:val="18"/>
+              </w:rPr>
+              <w:t>241</w:t>
+            </w:r>
+          </w:p>
+        </w:tc>
+        <w:tc>
+          <w:tcPr>
+            <w:tcW w:type="dxa" w:w="3515"/>
+          </w:tcPr>
+          <w:p>
+            <w:pPr>
+              <w:spacing w:after="0"/>
+              <w:jc w:val="right"/>
+            </w:pPr>
+            <w:r/>
+            <w:r>
+              <w:rPr>
+                <w:rFonts w:ascii="Consolas" w:hAnsi="Consolas"/>
+                <w:sz w:val="18"/>
+              </w:rPr>
+              <w:t>AnomalyCollector</w:t>
+            </w:r>
+            <w:r>
+              <w:rPr>
+                <w:sz w:val="18"/>
+              </w:rPr>
+              <w:t xml:space="preserve">, </w:t>
+            </w:r>
+            <w:r>
+              <w:rPr>
+                <w:rFonts w:ascii="Consolas" w:hAnsi="Consolas"/>
+                <w:sz w:val="18"/>
+              </w:rPr>
+              <w:t>/api/anomaly/events</w:t>
+            </w:r>
+            <w:r>
+              <w:rPr>
+                <w:sz w:val="18"/>
+              </w:rPr>
+              <w:t xml:space="preserve">, </w:t>
+            </w:r>
+            <w:r>
+              <w:rPr>
+                <w:rFonts w:ascii="Consolas" w:hAnsi="Consolas"/>
+                <w:sz w:val="18"/>
+              </w:rPr>
+              <w:t>/api/anomaly/label</w:t>
+            </w:r>
+          </w:p>
+        </w:tc>
+      </w:tr>
+      <w:tr>
+        <w:tc>
+          <w:tcPr>
+            <w:tcW w:type="dxa" w:w="4195"/>
+          </w:tcPr>
+          <w:p>
+            <w:pPr>
+              <w:spacing w:after="0"/>
+              <w:jc w:val="left"/>
+            </w:pPr>
+            <w:r/>
+            <w:r>
+              <w:rPr>
+                <w:rFonts w:ascii="Consolas" w:hAnsi="Consolas"/>
+                <w:sz w:val="18"/>
+              </w:rPr>
+              <w:t>static/js/anomaly.js</w:t>
+            </w:r>
+          </w:p>
+        </w:tc>
+        <w:tc>
+          <w:tcPr>
+            <w:tcW w:type="dxa" w:w="1020"/>
+          </w:tcPr>
+          <w:p>
+            <w:pPr>
+              <w:spacing w:after="0"/>
+              <w:jc w:val="right"/>
+            </w:pPr>
+            <w:r/>
+            <w:r>
+              <w:rPr>
+                <w:sz w:val="18"/>
+              </w:rPr>
+              <w:t>464</w:t>
+            </w:r>
+          </w:p>
+        </w:tc>
+        <w:tc>
+          <w:tcPr>
+            <w:tcW w:type="dxa" w:w="3515"/>
+          </w:tcPr>
+          <w:p>
+            <w:pPr>
+              <w:spacing w:after="0"/>
+              <w:jc w:val="right"/>
+            </w:pPr>
+            <w:r/>
+            <w:r>
+              <w:rPr>
+                <w:sz w:val="18"/>
+              </w:rPr>
+              <w:t>canlı grafik, ipucu kutusu, mandal, olay tablosu</w:t>
+            </w:r>
+          </w:p>
+        </w:tc>
+      </w:tr>
+      <w:tr>
+        <w:tc>
+          <w:tcPr>
+            <w:tcW w:type="dxa" w:w="4195"/>
+          </w:tcPr>
+          <w:p>
+            <w:pPr>
+              <w:spacing w:after="0"/>
+              <w:jc w:val="left"/>
+            </w:pPr>
+            <w:r/>
+            <w:r>
+              <w:rPr>
+                <w:rFonts w:ascii="Consolas" w:hAnsi="Consolas"/>
+                <w:sz w:val="18"/>
+              </w:rPr>
+              <w:t>static/css/anomaly.css</w:t>
+            </w:r>
+          </w:p>
+        </w:tc>
+        <w:tc>
+          <w:tcPr>
+            <w:tcW w:type="dxa" w:w="1020"/>
+          </w:tcPr>
+          <w:p>
+            <w:pPr>
+              <w:spacing w:after="0"/>
+              <w:jc w:val="right"/>
+            </w:pPr>
+            <w:r/>
+            <w:r>
+              <w:rPr>
+                <w:sz w:val="18"/>
+              </w:rPr>
+              <w:t>161</w:t>
+            </w:r>
+          </w:p>
+        </w:tc>
+        <w:tc>
+          <w:tcPr>
+            <w:tcW w:type="dxa" w:w="3515"/>
+          </w:tcPr>
+          <w:p>
+            <w:pPr>
+              <w:spacing w:after="0"/>
+              <w:jc w:val="right"/>
+            </w:pPr>
+            <w:r/>
+            <w:r>
+              <w:rPr>
+                <w:sz w:val="18"/>
+              </w:rPr>
+              <w:t>sekmenin biçemi</w:t>
+            </w:r>
+          </w:p>
+        </w:tc>
+      </w:tr>
+      <w:tr>
+        <w:tc>
+          <w:tcPr>
+            <w:tcW w:type="dxa" w:w="4195"/>
+          </w:tcPr>
+          <w:p>
+            <w:pPr>
+              <w:spacing w:after="0"/>
+              <w:jc w:val="left"/>
+            </w:pPr>
+            <w:r/>
+            <w:r>
+              <w:rPr>
+                <w:rFonts w:ascii="Consolas" w:hAnsi="Consolas"/>
+                <w:sz w:val="18"/>
+              </w:rPr>
+              <w:t>templates/index.html</w:t>
+            </w:r>
+          </w:p>
+        </w:tc>
+        <w:tc>
+          <w:tcPr>
+            <w:tcW w:type="dxa" w:w="1020"/>
+          </w:tcPr>
+          <w:p>
+            <w:pPr>
+              <w:spacing w:after="0"/>
+              <w:jc w:val="right"/>
+            </w:pPr>
+            <w:r/>
+            <w:r>
+              <w:rPr>
+                <w:sz w:val="18"/>
+              </w:rPr>
+              <w:t>—</w:t>
+            </w:r>
+          </w:p>
+        </w:tc>
+        <w:tc>
+          <w:tcPr>
+            <w:tcW w:type="dxa" w:w="3515"/>
+          </w:tcPr>
+          <w:p>
+            <w:pPr>
+              <w:spacing w:after="0"/>
+              <w:jc w:val="right"/>
+            </w:pPr>
+            <w:r/>
+            <w:r>
+              <w:rPr>
+                <w:sz w:val="18"/>
+              </w:rPr>
+              <w:t xml:space="preserve">üçüncü sekme ve </w:t>
+            </w:r>
+            <w:r>
+              <w:rPr>
+                <w:rFonts w:ascii="Consolas" w:hAnsi="Consolas"/>
+                <w:sz w:val="18"/>
+              </w:rPr>
+              <w:t>#view-anomaly</w:t>
+            </w:r>
+            <w:r>
+              <w:rPr>
+                <w:sz w:val="18"/>
+              </w:rPr>
+              <w:t xml:space="preserve"> görünümü</w:t>
+            </w:r>
+          </w:p>
+        </w:tc>
+      </w:tr>
+    </w:tbl>
+    <w:p>
+      <w:pPr>
+        <w:spacing w:before="60" w:after="240"/>
+        <w:jc w:val="left"/>
+      </w:pPr>
+      <w:r>
+        <w:rPr>
+          <w:i/>
+          <w:color w:val="555F6B"/>
+          <w:sz w:val="18"/>
+        </w:rPr>
+        <w:t xml:space="preserve">Tablo 13.2. Operatör arayüzü tarafı (Bölüm 10.7). Bu dosyalar </w:t>
+      </w:r>
+      <w:r>
+        <w:rPr>
+          <w:rFonts w:ascii="Consolas" w:hAnsi="Consolas"/>
+          <w:color w:val="555F6B"/>
+          <w:sz w:val="17"/>
+        </w:rPr>
+        <w:t>anomaly_detection</w:t>
+      </w:r>
+      <w:r>
+        <w:rPr>
+          <w:i/>
+          <w:color w:val="555F6B"/>
+          <w:sz w:val="18"/>
+        </w:rPr>
+        <w:t xml:space="preserve"> paketine değil, laboratuvarın mevcut kontrol panosuna aittir; dedektör düğümü arayüz olmadan da tam işlevlidir.</w:t>
       </w:r>
     </w:p>
     <w:p>

</xml_diff>